<commit_message>
Work reports compliant with GOST standards
</commit_message>
<xml_diff>
--- a/Отчёты/ИСП-34_Шевченко.Е.Т_Лабораторная работа №0.docx
+++ b/Отчёты/ИСП-34_Шевченко.Е.Т_Лабораторная работа №0.docx
@@ -51,21 +51,8 @@
           <w:szCs w:val="32"/>
           <w:lang w:eastAsia="ru-RU"/>
         </w:rPr>
-        <w:t xml:space="preserve">Тема: Изучение и практическое применение распределенной системы контроля версий </w:t>
-      </w:r>
-      <w:proofErr w:type="spellStart"/>
-      <w:r>
-        <w:rPr>
-          <w:rFonts w:ascii="Times New Roman" w:eastAsia="Times New Roman" w:hAnsi="Times New Roman" w:cs="Times New Roman"/>
-          <w:b/>
-          <w:bCs/>
-          <w:sz w:val="32"/>
-          <w:szCs w:val="32"/>
-          <w:lang w:eastAsia="ru-RU"/>
-        </w:rPr>
-        <w:t>Git</w:t>
-      </w:r>
-      <w:proofErr w:type="spellEnd"/>
+        <w:t>Тема: Изучение и практическое применение распределенной системы контроля версий Git</w:t>
+      </w:r>
     </w:p>
     <w:p>
       <w:pPr>
@@ -140,9 +127,48 @@
           <w:szCs w:val="28"/>
           <w:lang w:eastAsia="ru-RU"/>
         </w:rPr>
-        <w:t xml:space="preserve">Репозиторий в </w:t>
-      </w:r>
-      <w:proofErr w:type="spellStart"/>
+        <w:t>Репозиторий в Git</w:t>
+      </w:r>
+      <w:r>
+        <w:rPr>
+          <w:rFonts w:ascii="Times New Roman" w:eastAsia="Times New Roman" w:hAnsi="Times New Roman" w:cs="Times New Roman"/>
+          <w:sz w:val="28"/>
+          <w:szCs w:val="28"/>
+          <w:lang w:eastAsia="ru-RU"/>
+        </w:rPr>
+        <w:t xml:space="preserve"> </w:t>
+      </w:r>
+      <w:r>
+        <w:rPr>
+          <w:rFonts w:ascii="Times New Roman" w:eastAsia="Times New Roman" w:hAnsi="Times New Roman" w:cs="Times New Roman"/>
+          <w:sz w:val="28"/>
+          <w:szCs w:val="28"/>
+          <w:lang w:eastAsia="ru-RU"/>
+        </w:rPr>
+        <w:t>-</w:t>
+      </w:r>
+      <w:r>
+        <w:rPr>
+          <w:rFonts w:ascii="Times New Roman" w:eastAsia="Times New Roman" w:hAnsi="Times New Roman" w:cs="Times New Roman"/>
+          <w:sz w:val="28"/>
+          <w:szCs w:val="28"/>
+          <w:lang w:eastAsia="ru-RU"/>
+        </w:rPr>
+        <w:t xml:space="preserve"> это умная папка с проектом, внутри которой находятся скрытые файлы Git. Они отслеживают состояние проекта, регистрируют любые изменения и поэтапно сохраняют их в историю по команде пользователя.</w:t>
+      </w:r>
+    </w:p>
+    <w:p>
+      <w:pPr>
+        <w:spacing w:after="0" w:line="360" w:lineRule="auto"/>
+        <w:ind w:firstLine="709"/>
+        <w:jc w:val="both"/>
+        <w:rPr>
+          <w:rFonts w:ascii="Times New Roman" w:eastAsia="Times New Roman" w:hAnsi="Times New Roman" w:cs="Times New Roman"/>
+          <w:sz w:val="28"/>
+          <w:szCs w:val="28"/>
+          <w:lang w:eastAsia="ru-RU"/>
+        </w:rPr>
+      </w:pPr>
       <w:r>
         <w:rPr>
           <w:rFonts w:ascii="Times New Roman" w:eastAsia="Times New Roman" w:hAnsi="Times New Roman" w:cs="Times New Roman"/>
@@ -152,89 +178,6 @@
           <w:szCs w:val="28"/>
           <w:lang w:eastAsia="ru-RU"/>
         </w:rPr>
-        <w:t>Git</w:t>
-      </w:r>
-      <w:proofErr w:type="spellEnd"/>
-      <w:r>
-        <w:rPr>
-          <w:rFonts w:ascii="Times New Roman" w:eastAsia="Times New Roman" w:hAnsi="Times New Roman" w:cs="Times New Roman"/>
-          <w:sz w:val="28"/>
-          <w:szCs w:val="28"/>
-          <w:lang w:eastAsia="ru-RU"/>
-        </w:rPr>
-        <w:t xml:space="preserve"> </w:t>
-      </w:r>
-      <w:proofErr w:type="gramStart"/>
-      <w:r>
-        <w:rPr>
-          <w:rFonts w:ascii="Times New Roman" w:eastAsia="Times New Roman" w:hAnsi="Times New Roman" w:cs="Times New Roman"/>
-          <w:sz w:val="28"/>
-          <w:szCs w:val="28"/>
-          <w:lang w:eastAsia="ru-RU"/>
-        </w:rPr>
-        <w:t>-</w:t>
-      </w:r>
-      <w:r>
-        <w:rPr>
-          <w:rFonts w:ascii="Times New Roman" w:eastAsia="Times New Roman" w:hAnsi="Times New Roman" w:cs="Times New Roman"/>
-          <w:sz w:val="28"/>
-          <w:szCs w:val="28"/>
-          <w:lang w:eastAsia="ru-RU"/>
-        </w:rPr>
-        <w:t xml:space="preserve"> это</w:t>
-      </w:r>
-      <w:proofErr w:type="gramEnd"/>
-      <w:r>
-        <w:rPr>
-          <w:rFonts w:ascii="Times New Roman" w:eastAsia="Times New Roman" w:hAnsi="Times New Roman" w:cs="Times New Roman"/>
-          <w:sz w:val="28"/>
-          <w:szCs w:val="28"/>
-          <w:lang w:eastAsia="ru-RU"/>
-        </w:rPr>
-        <w:t xml:space="preserve"> умная папка с проектом, внутри которой находятся скрытые файлы </w:t>
-      </w:r>
-      <w:proofErr w:type="spellStart"/>
-      <w:r>
-        <w:rPr>
-          <w:rFonts w:ascii="Times New Roman" w:eastAsia="Times New Roman" w:hAnsi="Times New Roman" w:cs="Times New Roman"/>
-          <w:sz w:val="28"/>
-          <w:szCs w:val="28"/>
-          <w:lang w:eastAsia="ru-RU"/>
-        </w:rPr>
-        <w:t>Git</w:t>
-      </w:r>
-      <w:proofErr w:type="spellEnd"/>
-      <w:r>
-        <w:rPr>
-          <w:rFonts w:ascii="Times New Roman" w:eastAsia="Times New Roman" w:hAnsi="Times New Roman" w:cs="Times New Roman"/>
-          <w:sz w:val="28"/>
-          <w:szCs w:val="28"/>
-          <w:lang w:eastAsia="ru-RU"/>
-        </w:rPr>
-        <w:t>. Они отслеживают состояние проекта, регистрируют любые изменения и поэтапно сохраняют их в историю по команде пользователя.</w:t>
-      </w:r>
-    </w:p>
-    <w:p>
-      <w:pPr>
-        <w:spacing w:after="0" w:line="360" w:lineRule="auto"/>
-        <w:ind w:firstLine="709"/>
-        <w:jc w:val="both"/>
-        <w:rPr>
-          <w:rFonts w:ascii="Times New Roman" w:eastAsia="Times New Roman" w:hAnsi="Times New Roman" w:cs="Times New Roman"/>
-          <w:sz w:val="28"/>
-          <w:szCs w:val="28"/>
-          <w:lang w:eastAsia="ru-RU"/>
-        </w:rPr>
-      </w:pPr>
-      <w:r>
-        <w:rPr>
-          <w:rFonts w:ascii="Times New Roman" w:eastAsia="Times New Roman" w:hAnsi="Times New Roman" w:cs="Times New Roman"/>
-          <w:b/>
-          <w:bCs/>
-          <w:sz w:val="28"/>
-          <w:szCs w:val="28"/>
-          <w:lang w:eastAsia="ru-RU"/>
-        </w:rPr>
         <w:t>Ключевое отличие</w:t>
       </w:r>
       <w:r>
@@ -244,27 +187,7 @@
           <w:szCs w:val="28"/>
           <w:lang w:eastAsia="ru-RU"/>
         </w:rPr>
-        <w:t xml:space="preserve"> распределенных систем (DVCS, таких как </w:t>
-      </w:r>
-      <w:proofErr w:type="spellStart"/>
-      <w:r>
-        <w:rPr>
-          <w:rFonts w:ascii="Times New Roman" w:eastAsia="Times New Roman" w:hAnsi="Times New Roman" w:cs="Times New Roman"/>
-          <w:sz w:val="28"/>
-          <w:szCs w:val="28"/>
-          <w:lang w:eastAsia="ru-RU"/>
-        </w:rPr>
-        <w:t>Git</w:t>
-      </w:r>
-      <w:proofErr w:type="spellEnd"/>
-      <w:r>
-        <w:rPr>
-          <w:rFonts w:ascii="Times New Roman" w:eastAsia="Times New Roman" w:hAnsi="Times New Roman" w:cs="Times New Roman"/>
-          <w:sz w:val="28"/>
-          <w:szCs w:val="28"/>
-          <w:lang w:eastAsia="ru-RU"/>
-        </w:rPr>
-        <w:t>) от централизованных (CVCS, таких как SVN) заключается в архитектуре хранения данных:</w:t>
+        <w:t xml:space="preserve"> распределенных систем (DVCS, таких как Git) от централизованных (CVCS, таких как SVN) заключается в архитектуре хранения данных:</w:t>
       </w:r>
     </w:p>
     <w:p>
@@ -356,27 +279,7 @@
           <w:szCs w:val="28"/>
           <w:lang w:eastAsia="ru-RU"/>
         </w:rPr>
-        <w:t xml:space="preserve"> каждый разработчик имеет на своем локальном компьютере полную автономную копию репозитория со всей историей изменений. Центральный сервер (например, </w:t>
-      </w:r>
-      <w:proofErr w:type="spellStart"/>
-      <w:r>
-        <w:rPr>
-          <w:rFonts w:ascii="Times New Roman" w:eastAsia="Times New Roman" w:hAnsi="Times New Roman" w:cs="Times New Roman"/>
-          <w:sz w:val="28"/>
-          <w:szCs w:val="28"/>
-          <w:lang w:eastAsia="ru-RU"/>
-        </w:rPr>
-        <w:t>GitHub</w:t>
-      </w:r>
-      <w:proofErr w:type="spellEnd"/>
-      <w:r>
-        <w:rPr>
-          <w:rFonts w:ascii="Times New Roman" w:eastAsia="Times New Roman" w:hAnsi="Times New Roman" w:cs="Times New Roman"/>
-          <w:sz w:val="28"/>
-          <w:szCs w:val="28"/>
-          <w:lang w:eastAsia="ru-RU"/>
-        </w:rPr>
-        <w:t>) используется лишь как точка синхронизации.</w:t>
+        <w:t xml:space="preserve"> каждый разработчик имеет на своем локальном компьютере полную автономную копию репозитория со всей историей изменений. Центральный сервер (например, GitHub) используется лишь как точка синхронизации.</w:t>
       </w:r>
     </w:p>
     <w:p>
@@ -471,27 +374,7 @@
           <w:szCs w:val="28"/>
           <w:lang w:eastAsia="ru-RU"/>
         </w:rPr>
-        <w:t xml:space="preserve">Была выполнена локальная настройка проекта и синхронизация с удаленным сервером </w:t>
-      </w:r>
-      <w:proofErr w:type="spellStart"/>
-      <w:r>
-        <w:rPr>
-          <w:rFonts w:ascii="Times New Roman" w:eastAsia="Times New Roman" w:hAnsi="Times New Roman" w:cs="Times New Roman"/>
-          <w:sz w:val="28"/>
-          <w:szCs w:val="28"/>
-          <w:lang w:eastAsia="ru-RU"/>
-        </w:rPr>
-        <w:t>GitHub</w:t>
-      </w:r>
-      <w:proofErr w:type="spellEnd"/>
-      <w:r>
-        <w:rPr>
-          <w:rFonts w:ascii="Times New Roman" w:eastAsia="Times New Roman" w:hAnsi="Times New Roman" w:cs="Times New Roman"/>
-          <w:sz w:val="28"/>
-          <w:szCs w:val="28"/>
-          <w:lang w:eastAsia="ru-RU"/>
-        </w:rPr>
-        <w:t>.</w:t>
+        <w:t>Была выполнена локальная настройка проекта и синхронизация с удаленным сервером GitHub.</w:t>
       </w:r>
     </w:p>
     <w:p>
@@ -567,29 +450,16 @@
           <w:szCs w:val="28"/>
         </w:rPr>
       </w:pPr>
-      <w:proofErr w:type="spellStart"/>
-      <w:r>
-        <w:rPr>
-          <w:rFonts w:ascii="Times New Roman" w:hAnsi="Times New Roman" w:cs="Times New Roman"/>
-          <w:i/>
-          <w:iCs/>
-          <w:color w:val="808080" w:themeColor="background1" w:themeShade="80"/>
-          <w:sz w:val="28"/>
-          <w:szCs w:val="28"/>
-        </w:rPr>
-        <w:t>cd</w:t>
-      </w:r>
-      <w:proofErr w:type="spellEnd"/>
-      <w:r>
-        <w:rPr>
-          <w:rFonts w:ascii="Times New Roman" w:hAnsi="Times New Roman" w:cs="Times New Roman"/>
-          <w:i/>
-          <w:iCs/>
-          <w:color w:val="808080" w:themeColor="background1" w:themeShade="80"/>
-          <w:sz w:val="28"/>
-          <w:szCs w:val="28"/>
-        </w:rPr>
-        <w:t xml:space="preserve"> "D:\Репозитории\Инженерно-техническая поддержка сопро</w:t>
+      <w:r>
+        <w:rPr>
+          <w:rFonts w:ascii="Times New Roman" w:hAnsi="Times New Roman" w:cs="Times New Roman"/>
+          <w:i/>
+          <w:iCs/>
+          <w:color w:val="808080" w:themeColor="background1" w:themeShade="80"/>
+          <w:sz w:val="28"/>
+          <w:szCs w:val="28"/>
+        </w:rPr>
+        <w:t>cd "D:\Репозитории\Инженерно-техническая поддержка сопро</w:t>
       </w:r>
       <w:r>
         <w:rPr>
@@ -674,7 +544,6 @@
         </w:rPr>
         <w:t xml:space="preserve">Был произведен анализ состояний файлов через </w:t>
       </w:r>
-      <w:proofErr w:type="spellStart"/>
       <w:r>
         <w:rPr>
           <w:rStyle w:val="HTML"/>
@@ -682,9 +551,17 @@
           <w:sz w:val="28"/>
           <w:szCs w:val="28"/>
         </w:rPr>
-        <w:t>git</w:t>
-      </w:r>
-      <w:proofErr w:type="spellEnd"/>
+        <w:t>git status</w:t>
+      </w:r>
+      <w:r>
+        <w:rPr>
+          <w:rStyle w:val="inqyif"/>
+          <w:rFonts w:ascii="Times New Roman" w:hAnsi="Times New Roman" w:cs="Times New Roman"/>
+          <w:sz w:val="28"/>
+          <w:szCs w:val="28"/>
+        </w:rPr>
+        <w:t>. Проведено индексирование (</w:t>
+      </w:r>
       <w:r>
         <w:rPr>
           <w:rStyle w:val="HTML"/>
@@ -692,9 +569,17 @@
           <w:sz w:val="28"/>
           <w:szCs w:val="28"/>
         </w:rPr>
-        <w:t xml:space="preserve"> </w:t>
-      </w:r>
-      <w:proofErr w:type="spellStart"/>
+        <w:t>git add .</w:t>
+      </w:r>
+      <w:r>
+        <w:rPr>
+          <w:rStyle w:val="inqyif"/>
+          <w:rFonts w:ascii="Times New Roman" w:hAnsi="Times New Roman" w:cs="Times New Roman"/>
+          <w:sz w:val="28"/>
+          <w:szCs w:val="28"/>
+        </w:rPr>
+        <w:t xml:space="preserve">) и локальное сохранение всех рабочих файлов проекта (включая директорию </w:t>
+      </w:r>
       <w:r>
         <w:rPr>
           <w:rStyle w:val="HTML"/>
@@ -702,9 +587,8 @@
           <w:sz w:val="28"/>
           <w:szCs w:val="28"/>
         </w:rPr>
-        <w:t>status</w:t>
-      </w:r>
-      <w:proofErr w:type="spellEnd"/>
+        <w:t>Lab0/</w:t>
+      </w:r>
       <w:r>
         <w:rPr>
           <w:rStyle w:val="inqyif"/>
@@ -712,9 +596,8 @@
           <w:sz w:val="28"/>
           <w:szCs w:val="28"/>
         </w:rPr>
-        <w:t>. Проведено индексирование (</w:t>
-      </w:r>
-      <w:proofErr w:type="spellStart"/>
+        <w:t xml:space="preserve">, содержащую файлы </w:t>
+      </w:r>
       <w:r>
         <w:rPr>
           <w:rStyle w:val="HTML"/>
@@ -722,9 +605,17 @@
           <w:sz w:val="28"/>
           <w:szCs w:val="28"/>
         </w:rPr>
-        <w:t>git</w:t>
-      </w:r>
-      <w:proofErr w:type="spellEnd"/>
+        <w:t>README.md</w:t>
+      </w:r>
+      <w:r>
+        <w:rPr>
+          <w:rStyle w:val="inqyif"/>
+          <w:rFonts w:ascii="Times New Roman" w:hAnsi="Times New Roman" w:cs="Times New Roman"/>
+          <w:sz w:val="28"/>
+          <w:szCs w:val="28"/>
+        </w:rPr>
+        <w:t xml:space="preserve">, </w:t>
+      </w:r>
       <w:r>
         <w:rPr>
           <w:rStyle w:val="HTML"/>
@@ -732,10 +623,17 @@
           <w:sz w:val="28"/>
           <w:szCs w:val="28"/>
         </w:rPr>
-        <w:t xml:space="preserve"> </w:t>
-      </w:r>
-      <w:proofErr w:type="spellStart"/>
-      <w:proofErr w:type="gramStart"/>
+        <w:t>about.md</w:t>
+      </w:r>
+      <w:r>
+        <w:rPr>
+          <w:rStyle w:val="inqyif"/>
+          <w:rFonts w:ascii="Times New Roman" w:hAnsi="Times New Roman" w:cs="Times New Roman"/>
+          <w:sz w:val="28"/>
+          <w:szCs w:val="28"/>
+        </w:rPr>
+        <w:t xml:space="preserve"> и </w:t>
+      </w:r>
       <w:r>
         <w:rPr>
           <w:rStyle w:val="HTML"/>
@@ -743,89 +641,6 @@
           <w:sz w:val="28"/>
           <w:szCs w:val="28"/>
         </w:rPr>
-        <w:t>add</w:t>
-      </w:r>
-      <w:proofErr w:type="spellEnd"/>
-      <w:r>
-        <w:rPr>
-          <w:rStyle w:val="HTML"/>
-          <w:rFonts w:ascii="Times New Roman" w:eastAsiaTheme="minorHAnsi" w:hAnsi="Times New Roman" w:cs="Times New Roman"/>
-          <w:sz w:val="28"/>
-          <w:szCs w:val="28"/>
-        </w:rPr>
-        <w:t xml:space="preserve"> .</w:t>
-      </w:r>
-      <w:proofErr w:type="gramEnd"/>
-      <w:r>
-        <w:rPr>
-          <w:rStyle w:val="inqyif"/>
-          <w:rFonts w:ascii="Times New Roman" w:hAnsi="Times New Roman" w:cs="Times New Roman"/>
-          <w:sz w:val="28"/>
-          <w:szCs w:val="28"/>
-        </w:rPr>
-        <w:t xml:space="preserve">) и локальное сохранение всех рабочих файлов проекта (включая директорию </w:t>
-      </w:r>
-      <w:r>
-        <w:rPr>
-          <w:rStyle w:val="HTML"/>
-          <w:rFonts w:ascii="Times New Roman" w:eastAsiaTheme="minorHAnsi" w:hAnsi="Times New Roman" w:cs="Times New Roman"/>
-          <w:sz w:val="28"/>
-          <w:szCs w:val="28"/>
-        </w:rPr>
-        <w:t>Lab0/</w:t>
-      </w:r>
-      <w:r>
-        <w:rPr>
-          <w:rStyle w:val="inqyif"/>
-          <w:rFonts w:ascii="Times New Roman" w:hAnsi="Times New Roman" w:cs="Times New Roman"/>
-          <w:sz w:val="28"/>
-          <w:szCs w:val="28"/>
-        </w:rPr>
-        <w:t xml:space="preserve">, содержащую файлы </w:t>
-      </w:r>
-      <w:r>
-        <w:rPr>
-          <w:rStyle w:val="HTML"/>
-          <w:rFonts w:ascii="Times New Roman" w:eastAsiaTheme="minorHAnsi" w:hAnsi="Times New Roman" w:cs="Times New Roman"/>
-          <w:sz w:val="28"/>
-          <w:szCs w:val="28"/>
-        </w:rPr>
-        <w:t>README.md</w:t>
-      </w:r>
-      <w:r>
-        <w:rPr>
-          <w:rStyle w:val="inqyif"/>
-          <w:rFonts w:ascii="Times New Roman" w:hAnsi="Times New Roman" w:cs="Times New Roman"/>
-          <w:sz w:val="28"/>
-          <w:szCs w:val="28"/>
-        </w:rPr>
-        <w:t xml:space="preserve">, </w:t>
-      </w:r>
-      <w:r>
-        <w:rPr>
-          <w:rStyle w:val="HTML"/>
-          <w:rFonts w:ascii="Times New Roman" w:eastAsiaTheme="minorHAnsi" w:hAnsi="Times New Roman" w:cs="Times New Roman"/>
-          <w:sz w:val="28"/>
-          <w:szCs w:val="28"/>
-        </w:rPr>
-        <w:t>about.md</w:t>
-      </w:r>
-      <w:r>
-        <w:rPr>
-          <w:rStyle w:val="inqyif"/>
-          <w:rFonts w:ascii="Times New Roman" w:hAnsi="Times New Roman" w:cs="Times New Roman"/>
-          <w:sz w:val="28"/>
-          <w:szCs w:val="28"/>
-        </w:rPr>
-        <w:t xml:space="preserve"> и </w:t>
-      </w:r>
-      <w:r>
-        <w:rPr>
-          <w:rStyle w:val="HTML"/>
-          <w:rFonts w:ascii="Times New Roman" w:eastAsiaTheme="minorHAnsi" w:hAnsi="Times New Roman" w:cs="Times New Roman"/>
-          <w:sz w:val="28"/>
-          <w:szCs w:val="28"/>
-        </w:rPr>
         <w:t>git_commands.txt</w:t>
       </w:r>
       <w:r>
@@ -851,55 +666,248 @@
           <w:color w:val="808080" w:themeColor="background1" w:themeShade="80"/>
           <w:sz w:val="28"/>
           <w:szCs w:val="28"/>
-        </w:rPr>
-      </w:pPr>
-      <w:proofErr w:type="spellStart"/>
-      <w:r>
-        <w:rPr>
-          <w:rFonts w:ascii="Times New Roman" w:hAnsi="Times New Roman" w:cs="Times New Roman"/>
-          <w:i/>
-          <w:iCs/>
-          <w:color w:val="808080" w:themeColor="background1" w:themeShade="80"/>
-          <w:sz w:val="28"/>
-          <w:szCs w:val="28"/>
-        </w:rPr>
-        <w:t>git</w:t>
-      </w:r>
-      <w:proofErr w:type="spellEnd"/>
-      <w:r>
-        <w:rPr>
-          <w:rFonts w:ascii="Times New Roman" w:hAnsi="Times New Roman" w:cs="Times New Roman"/>
-          <w:i/>
-          <w:iCs/>
-          <w:color w:val="808080" w:themeColor="background1" w:themeShade="80"/>
-          <w:sz w:val="28"/>
-          <w:szCs w:val="28"/>
-        </w:rPr>
-        <w:t xml:space="preserve"> </w:t>
-      </w:r>
-      <w:proofErr w:type="spellStart"/>
-      <w:r>
-        <w:rPr>
-          <w:rFonts w:ascii="Times New Roman" w:hAnsi="Times New Roman" w:cs="Times New Roman"/>
-          <w:i/>
-          <w:iCs/>
-          <w:color w:val="808080" w:themeColor="background1" w:themeShade="80"/>
-          <w:sz w:val="28"/>
-          <w:szCs w:val="28"/>
-        </w:rPr>
-        <w:t>commit</w:t>
-      </w:r>
-      <w:proofErr w:type="spellEnd"/>
-      <w:r>
-        <w:rPr>
-          <w:rFonts w:ascii="Times New Roman" w:hAnsi="Times New Roman" w:cs="Times New Roman"/>
-          <w:i/>
-          <w:iCs/>
-          <w:color w:val="808080" w:themeColor="background1" w:themeShade="80"/>
-          <w:sz w:val="28"/>
-          <w:szCs w:val="28"/>
-        </w:rPr>
-        <w:t xml:space="preserve"> -m "Добавить все файлы проекта"</w:t>
+          <w:lang w:val="en-US"/>
+        </w:rPr>
+      </w:pPr>
+      <w:r>
+        <w:rPr>
+          <w:rFonts w:ascii="Times New Roman" w:hAnsi="Times New Roman" w:cs="Times New Roman"/>
+          <w:i/>
+          <w:iCs/>
+          <w:color w:val="808080" w:themeColor="background1" w:themeShade="80"/>
+          <w:sz w:val="28"/>
+          <w:szCs w:val="28"/>
+          <w:lang w:val="en-US"/>
+        </w:rPr>
+        <w:t xml:space="preserve">git commit -m </w:t>
+      </w:r>
+      <w:r>
+        <w:rPr>
+          <w:rFonts w:ascii="Times New Roman" w:hAnsi="Times New Roman" w:cs="Times New Roman"/>
+          <w:i/>
+          <w:iCs/>
+          <w:color w:val="808080" w:themeColor="background1" w:themeShade="80"/>
+          <w:sz w:val="28"/>
+          <w:szCs w:val="28"/>
+          <w:lang w:val="en-US"/>
+        </w:rPr>
+        <w:t>"</w:t>
+      </w:r>
+      <w:r>
+        <w:rPr>
+          <w:rFonts w:ascii="Times New Roman" w:hAnsi="Times New Roman" w:cs="Times New Roman"/>
+          <w:i/>
+          <w:iCs/>
+          <w:color w:val="808080" w:themeColor="background1" w:themeShade="80"/>
+          <w:sz w:val="28"/>
+          <w:szCs w:val="28"/>
+          <w:lang w:val="en-US"/>
+        </w:rPr>
+        <w:t>Name and group</w:t>
+      </w:r>
+      <w:r>
+        <w:rPr>
+          <w:rFonts w:ascii="Times New Roman" w:hAnsi="Times New Roman" w:cs="Times New Roman"/>
+          <w:i/>
+          <w:iCs/>
+          <w:color w:val="808080" w:themeColor="background1" w:themeShade="80"/>
+          <w:sz w:val="28"/>
+          <w:szCs w:val="28"/>
+          <w:lang w:val="en-US"/>
+        </w:rPr>
+        <w:t>"</w:t>
+      </w:r>
+      <w:r>
+        <w:rPr>
+          <w:rFonts w:ascii="Times New Roman" w:hAnsi="Times New Roman" w:cs="Times New Roman"/>
+          <w:i/>
+          <w:iCs/>
+          <w:color w:val="808080" w:themeColor="background1" w:themeShade="80"/>
+          <w:sz w:val="28"/>
+          <w:szCs w:val="28"/>
+          <w:lang w:val="en-US"/>
+        </w:rPr>
+        <w:t xml:space="preserve">, </w:t>
+      </w:r>
+      <w:r>
+        <w:rPr>
+          <w:rFonts w:ascii="Times New Roman" w:hAnsi="Times New Roman" w:cs="Times New Roman"/>
+          <w:i/>
+          <w:iCs/>
+          <w:color w:val="808080" w:themeColor="background1" w:themeShade="80"/>
+          <w:sz w:val="28"/>
+          <w:szCs w:val="28"/>
+          <w:lang w:val="en-US"/>
+        </w:rPr>
+        <w:t>"</w:t>
+      </w:r>
+      <w:r>
+        <w:rPr>
+          <w:rFonts w:ascii="Times New Roman" w:hAnsi="Times New Roman" w:cs="Times New Roman"/>
+          <w:i/>
+          <w:iCs/>
+          <w:color w:val="808080" w:themeColor="background1" w:themeShade="80"/>
+          <w:sz w:val="28"/>
+          <w:szCs w:val="28"/>
+          <w:lang w:val="en-US"/>
+        </w:rPr>
+        <w:t>Work reports compliant with GOST standards</w:t>
+      </w:r>
+      <w:r>
+        <w:rPr>
+          <w:rFonts w:ascii="Times New Roman" w:hAnsi="Times New Roman" w:cs="Times New Roman"/>
+          <w:i/>
+          <w:iCs/>
+          <w:color w:val="808080" w:themeColor="background1" w:themeShade="80"/>
+          <w:sz w:val="28"/>
+          <w:szCs w:val="28"/>
+          <w:lang w:val="en-US"/>
+        </w:rPr>
+        <w:t>"</w:t>
+      </w:r>
+      <w:r>
+        <w:rPr>
+          <w:rFonts w:ascii="Times New Roman" w:hAnsi="Times New Roman" w:cs="Times New Roman"/>
+          <w:i/>
+          <w:iCs/>
+          <w:color w:val="808080" w:themeColor="background1" w:themeShade="80"/>
+          <w:sz w:val="28"/>
+          <w:szCs w:val="28"/>
+          <w:lang w:val="en-US"/>
+        </w:rPr>
+        <w:t xml:space="preserve">, </w:t>
+      </w:r>
+      <w:r>
+        <w:rPr>
+          <w:rFonts w:ascii="Times New Roman" w:hAnsi="Times New Roman" w:cs="Times New Roman"/>
+          <w:i/>
+          <w:iCs/>
+          <w:color w:val="808080" w:themeColor="background1" w:themeShade="80"/>
+          <w:sz w:val="28"/>
+          <w:szCs w:val="28"/>
+          <w:lang w:val="en-US"/>
+        </w:rPr>
+        <w:t>"</w:t>
+      </w:r>
+      <w:r>
+        <w:rPr>
+          <w:rFonts w:ascii="Times New Roman" w:hAnsi="Times New Roman" w:cs="Times New Roman"/>
+          <w:i/>
+          <w:iCs/>
+          <w:color w:val="808080" w:themeColor="background1" w:themeShade="80"/>
+          <w:sz w:val="28"/>
+          <w:szCs w:val="28"/>
+          <w:lang w:val="en-US"/>
+        </w:rPr>
+        <w:t>Cheat sheet of basic Git commands</w:t>
+      </w:r>
+      <w:r>
+        <w:rPr>
+          <w:rFonts w:ascii="Times New Roman" w:hAnsi="Times New Roman" w:cs="Times New Roman"/>
+          <w:i/>
+          <w:iCs/>
+          <w:color w:val="808080" w:themeColor="background1" w:themeShade="80"/>
+          <w:sz w:val="28"/>
+          <w:szCs w:val="28"/>
+          <w:lang w:val="en-US"/>
+        </w:rPr>
+        <w:t>"</w:t>
+      </w:r>
+      <w:r>
+        <w:rPr>
+          <w:rFonts w:ascii="Times New Roman" w:hAnsi="Times New Roman" w:cs="Times New Roman"/>
+          <w:i/>
+          <w:iCs/>
+          <w:color w:val="808080" w:themeColor="background1" w:themeShade="80"/>
+          <w:sz w:val="28"/>
+          <w:szCs w:val="28"/>
+          <w:lang w:val="en-US"/>
+        </w:rPr>
+        <w:t xml:space="preserve">, </w:t>
+      </w:r>
+      <w:r>
+        <w:rPr>
+          <w:rFonts w:ascii="Times New Roman" w:hAnsi="Times New Roman" w:cs="Times New Roman"/>
+          <w:i/>
+          <w:iCs/>
+          <w:color w:val="808080" w:themeColor="background1" w:themeShade="80"/>
+          <w:sz w:val="28"/>
+          <w:szCs w:val="28"/>
+          <w:lang w:val="en-US"/>
+        </w:rPr>
+        <w:t>"</w:t>
+      </w:r>
+      <w:r>
+        <w:rPr>
+          <w:rFonts w:ascii="Times New Roman" w:hAnsi="Times New Roman" w:cs="Times New Roman"/>
+          <w:i/>
+          <w:iCs/>
+          <w:color w:val="808080" w:themeColor="background1" w:themeShade="80"/>
+          <w:sz w:val="28"/>
+          <w:szCs w:val="28"/>
+          <w:lang w:val="en-US"/>
+        </w:rPr>
+        <w:t>Cheat sheet of basic Git commands</w:t>
+      </w:r>
+      <w:r>
+        <w:rPr>
+          <w:rFonts w:ascii="Times New Roman" w:hAnsi="Times New Roman" w:cs="Times New Roman"/>
+          <w:i/>
+          <w:iCs/>
+          <w:color w:val="808080" w:themeColor="background1" w:themeShade="80"/>
+          <w:sz w:val="28"/>
+          <w:szCs w:val="28"/>
+          <w:lang w:val="en-US"/>
+        </w:rPr>
+        <w:t>"</w:t>
+      </w:r>
+      <w:r>
+        <w:rPr>
+          <w:rFonts w:ascii="Times New Roman" w:hAnsi="Times New Roman" w:cs="Times New Roman"/>
+          <w:i/>
+          <w:iCs/>
+          <w:color w:val="808080" w:themeColor="background1" w:themeShade="80"/>
+          <w:sz w:val="28"/>
+          <w:szCs w:val="28"/>
+          <w:lang w:val="en-US"/>
+        </w:rPr>
+        <w:t xml:space="preserve">, </w:t>
+      </w:r>
+      <w:r>
+        <w:rPr>
+          <w:rFonts w:ascii="Times New Roman" w:hAnsi="Times New Roman" w:cs="Times New Roman"/>
+          <w:i/>
+          <w:iCs/>
+          <w:color w:val="808080" w:themeColor="background1" w:themeShade="80"/>
+          <w:sz w:val="28"/>
+          <w:szCs w:val="28"/>
+          <w:lang w:val="en-US"/>
+        </w:rPr>
+        <w:t>"</w:t>
+      </w:r>
+      <w:r>
+        <w:rPr>
+          <w:rFonts w:ascii="Times New Roman" w:hAnsi="Times New Roman" w:cs="Times New Roman"/>
+          <w:i/>
+          <w:iCs/>
+          <w:color w:val="808080" w:themeColor="background1" w:themeShade="80"/>
+          <w:sz w:val="28"/>
+          <w:szCs w:val="28"/>
+          <w:lang w:val="en-US"/>
+        </w:rPr>
+        <w:t>Project goals and summary description</w:t>
+      </w:r>
+      <w:r>
+        <w:rPr>
+          <w:rFonts w:ascii="Times New Roman" w:hAnsi="Times New Roman" w:cs="Times New Roman"/>
+          <w:i/>
+          <w:iCs/>
+          <w:color w:val="808080" w:themeColor="background1" w:themeShade="80"/>
+          <w:sz w:val="28"/>
+          <w:szCs w:val="28"/>
+          <w:lang w:val="en-US"/>
+        </w:rPr>
+        <w:t>"</w:t>
       </w:r>
     </w:p>
     <w:p>
@@ -928,10 +936,7 @@
         <w:t>Настройка</w:t>
       </w:r>
       <w:r>
-        <w:t>‎</w:t>
-      </w:r>
-      <w:r>
-        <w:t xml:space="preserve"> </w:t>
+        <w:t xml:space="preserve">‎ </w:t>
       </w:r>
       <w:r>
         <w:rPr>
@@ -957,47 +962,7 @@
           <w:sz w:val="28"/>
           <w:szCs w:val="28"/>
         </w:rPr>
-        <w:t xml:space="preserve">В процессе отправки возникла ошибка безопасности со стороны </w:t>
-      </w:r>
-      <w:proofErr w:type="spellStart"/>
-      <w:r>
-        <w:rPr>
-          <w:rStyle w:val="inqyif"/>
-          <w:rFonts w:ascii="Times New Roman" w:hAnsi="Times New Roman" w:cs="Times New Roman"/>
-          <w:sz w:val="28"/>
-          <w:szCs w:val="28"/>
-        </w:rPr>
-        <w:t>GitHub</w:t>
-      </w:r>
-      <w:proofErr w:type="spellEnd"/>
-      <w:r>
-        <w:rPr>
-          <w:rStyle w:val="inqyif"/>
-          <w:rFonts w:ascii="Times New Roman" w:hAnsi="Times New Roman" w:cs="Times New Roman"/>
-          <w:sz w:val="28"/>
-          <w:szCs w:val="28"/>
-        </w:rPr>
-        <w:t xml:space="preserve">, блокирующая пуши из-за раскрытия персонального </w:t>
-      </w:r>
-      <w:proofErr w:type="spellStart"/>
-      <w:r>
-        <w:rPr>
-          <w:rStyle w:val="inqyif"/>
-          <w:rFonts w:ascii="Times New Roman" w:hAnsi="Times New Roman" w:cs="Times New Roman"/>
-          <w:sz w:val="28"/>
-          <w:szCs w:val="28"/>
-        </w:rPr>
-        <w:t>email</w:t>
-      </w:r>
-      <w:proofErr w:type="spellEnd"/>
-      <w:r>
-        <w:rPr>
-          <w:rStyle w:val="inqyif"/>
-          <w:rFonts w:ascii="Times New Roman" w:hAnsi="Times New Roman" w:cs="Times New Roman"/>
-          <w:sz w:val="28"/>
-          <w:szCs w:val="28"/>
-        </w:rPr>
-        <w:t>.</w:t>
+        <w:t>В процессе отправки возникла ошибка безопасности со стороны GitHub, блокирующая пуши из-за раскрытия персонального email.</w:t>
       </w:r>
       <w:r>
         <w:rPr>
@@ -1042,47 +1007,7 @@
           <w:sz w:val="28"/>
           <w:szCs w:val="28"/>
         </w:rPr>
-        <w:t xml:space="preserve"> в настройках аккаунта </w:t>
-      </w:r>
-      <w:proofErr w:type="spellStart"/>
-      <w:r>
-        <w:rPr>
-          <w:rStyle w:val="inqyif"/>
-          <w:rFonts w:ascii="Times New Roman" w:hAnsi="Times New Roman" w:cs="Times New Roman"/>
-          <w:sz w:val="28"/>
-          <w:szCs w:val="28"/>
-        </w:rPr>
-        <w:t>GitHub</w:t>
-      </w:r>
-      <w:proofErr w:type="spellEnd"/>
-      <w:r>
-        <w:rPr>
-          <w:rStyle w:val="inqyif"/>
-          <w:rFonts w:ascii="Times New Roman" w:hAnsi="Times New Roman" w:cs="Times New Roman"/>
-          <w:sz w:val="28"/>
-          <w:szCs w:val="28"/>
-        </w:rPr>
-        <w:t xml:space="preserve"> был получен анонимный адрес робота-маски, который был успешно прописан в глобальную конфигурацию локального </w:t>
-      </w:r>
-      <w:proofErr w:type="spellStart"/>
-      <w:r>
-        <w:rPr>
-          <w:rStyle w:val="inqyif"/>
-          <w:rFonts w:ascii="Times New Roman" w:hAnsi="Times New Roman" w:cs="Times New Roman"/>
-          <w:sz w:val="28"/>
-          <w:szCs w:val="28"/>
-        </w:rPr>
-        <w:t>Git</w:t>
-      </w:r>
-      <w:proofErr w:type="spellEnd"/>
-      <w:r>
-        <w:rPr>
-          <w:rStyle w:val="inqyif"/>
-          <w:rFonts w:ascii="Times New Roman" w:hAnsi="Times New Roman" w:cs="Times New Roman"/>
-          <w:sz w:val="28"/>
-          <w:szCs w:val="28"/>
-        </w:rPr>
-        <w:t>:</w:t>
+        <w:t xml:space="preserve"> в настройках аккаунта GitHub был получен анонимный адрес робота-маски, который был успешно прописан в глобальную конфигурацию локального Git:</w:t>
       </w:r>
     </w:p>
     <w:p>
@@ -1111,35 +1036,7 @@
           <w:szCs w:val="28"/>
           <w:lang w:val="en-US"/>
         </w:rPr>
-        <w:t xml:space="preserve">git config --global </w:t>
-      </w:r>
-      <w:proofErr w:type="spellStart"/>
-      <w:proofErr w:type="gramStart"/>
-      <w:r>
-        <w:rPr>
-          <w:rFonts w:ascii="Times New Roman" w:hAnsi="Times New Roman" w:cs="Times New Roman"/>
-          <w:i/>
-          <w:iCs/>
-          <w:color w:val="808080" w:themeColor="background1" w:themeShade="80"/>
-          <w:sz w:val="28"/>
-          <w:szCs w:val="28"/>
-          <w:lang w:val="en-US"/>
-        </w:rPr>
-        <w:t>user.email</w:t>
-      </w:r>
-      <w:proofErr w:type="spellEnd"/>
-      <w:proofErr w:type="gramEnd"/>
-      <w:r>
-        <w:rPr>
-          <w:rFonts w:ascii="Times New Roman" w:hAnsi="Times New Roman" w:cs="Times New Roman"/>
-          <w:i/>
-          <w:iCs/>
-          <w:color w:val="808080" w:themeColor="background1" w:themeShade="80"/>
-          <w:sz w:val="28"/>
-          <w:szCs w:val="28"/>
-          <w:lang w:val="en-US"/>
-        </w:rPr>
-        <w:t xml:space="preserve"> "</w:t>
+        <w:t>git config --global user.email "</w:t>
       </w:r>
       <w:r>
         <w:rPr>
@@ -1263,27 +1160,7 @@
           <w:sz w:val="28"/>
           <w:szCs w:val="28"/>
         </w:rPr>
-        <w:t>Синхронизация с сервером (</w:t>
-      </w:r>
-      <w:proofErr w:type="spellStart"/>
-      <w:r>
-        <w:rPr>
-          <w:rStyle w:val="a3"/>
-          <w:rFonts w:ascii="Times New Roman" w:hAnsi="Times New Roman" w:cs="Times New Roman"/>
-          <w:sz w:val="28"/>
-          <w:szCs w:val="28"/>
-        </w:rPr>
-        <w:t>Push</w:t>
-      </w:r>
-      <w:proofErr w:type="spellEnd"/>
-      <w:r>
-        <w:rPr>
-          <w:rStyle w:val="a3"/>
-          <w:rFonts w:ascii="Times New Roman" w:hAnsi="Times New Roman" w:cs="Times New Roman"/>
-          <w:sz w:val="28"/>
-          <w:szCs w:val="28"/>
-        </w:rPr>
-        <w:t>):</w:t>
+        <w:t>Синхронизация с сервером (Push):</w:t>
       </w:r>
       <w:r>
         <w:rPr>
@@ -1318,43 +1195,17 @@
           <w:szCs w:val="28"/>
         </w:rPr>
       </w:pPr>
-      <w:proofErr w:type="spellStart"/>
-      <w:r>
-        <w:rPr>
-          <w:rFonts w:ascii="Times New Roman" w:hAnsi="Times New Roman" w:cs="Times New Roman"/>
-          <w:i/>
-          <w:iCs/>
-          <w:color w:val="808080" w:themeColor="background1" w:themeShade="80"/>
-          <w:sz w:val="28"/>
-          <w:szCs w:val="28"/>
-        </w:rPr>
-        <w:t>git</w:t>
-      </w:r>
-      <w:proofErr w:type="spellEnd"/>
-      <w:r>
-        <w:rPr>
-          <w:rFonts w:ascii="Times New Roman" w:hAnsi="Times New Roman" w:cs="Times New Roman"/>
-          <w:i/>
-          <w:iCs/>
-          <w:color w:val="808080" w:themeColor="background1" w:themeShade="80"/>
-          <w:sz w:val="28"/>
-          <w:szCs w:val="28"/>
-        </w:rPr>
-        <w:t xml:space="preserve"> </w:t>
-      </w:r>
-      <w:proofErr w:type="spellStart"/>
-      <w:r>
-        <w:rPr>
-          <w:rFonts w:ascii="Times New Roman" w:hAnsi="Times New Roman" w:cs="Times New Roman"/>
-          <w:i/>
-          <w:iCs/>
-          <w:color w:val="808080" w:themeColor="background1" w:themeShade="80"/>
-          <w:sz w:val="28"/>
-          <w:szCs w:val="28"/>
-        </w:rPr>
-        <w:t>push</w:t>
-      </w:r>
-      <w:proofErr w:type="spellEnd"/>
+      <w:r>
+        <w:rPr>
+          <w:rFonts w:ascii="Times New Roman" w:hAnsi="Times New Roman" w:cs="Times New Roman"/>
+          <w:i/>
+          <w:iCs/>
+          <w:color w:val="808080" w:themeColor="background1" w:themeShade="80"/>
+          <w:sz w:val="28"/>
+          <w:szCs w:val="28"/>
+        </w:rPr>
+        <w:t>git push</w:t>
+      </w:r>
     </w:p>
     <w:p>
       <w:pPr>
@@ -1425,112 +1276,18 @@
           <w:szCs w:val="28"/>
           <w:lang w:eastAsia="ru-RU"/>
         </w:rPr>
-        <w:t xml:space="preserve">Для закрепления теоретического материала и отработки навыков управления репозиторием со сложной структурой было выполнено практическое обучение в интерактивном симуляторе </w:t>
-      </w:r>
-      <w:proofErr w:type="spellStart"/>
-      <w:r>
-        <w:rPr>
-          <w:rFonts w:ascii="Times New Roman" w:eastAsia="Times New Roman" w:hAnsi="Times New Roman" w:cs="Times New Roman"/>
-          <w:sz w:val="28"/>
-          <w:szCs w:val="28"/>
-          <w:lang w:eastAsia="ru-RU"/>
-        </w:rPr>
-        <w:t>Learn</w:t>
-      </w:r>
-      <w:proofErr w:type="spellEnd"/>
-      <w:r>
-        <w:rPr>
-          <w:rFonts w:ascii="Times New Roman" w:eastAsia="Times New Roman" w:hAnsi="Times New Roman" w:cs="Times New Roman"/>
-          <w:sz w:val="28"/>
-          <w:szCs w:val="28"/>
-          <w:lang w:eastAsia="ru-RU"/>
-        </w:rPr>
-        <w:t xml:space="preserve"> </w:t>
-      </w:r>
-      <w:proofErr w:type="spellStart"/>
-      <w:r>
-        <w:rPr>
-          <w:rFonts w:ascii="Times New Roman" w:eastAsia="Times New Roman" w:hAnsi="Times New Roman" w:cs="Times New Roman"/>
-          <w:sz w:val="28"/>
-          <w:szCs w:val="28"/>
-          <w:lang w:eastAsia="ru-RU"/>
-        </w:rPr>
-        <w:t>Git</w:t>
-      </w:r>
-      <w:proofErr w:type="spellEnd"/>
-      <w:r>
-        <w:rPr>
-          <w:rFonts w:ascii="Times New Roman" w:eastAsia="Times New Roman" w:hAnsi="Times New Roman" w:cs="Times New Roman"/>
-          <w:sz w:val="28"/>
-          <w:szCs w:val="28"/>
-          <w:lang w:eastAsia="ru-RU"/>
-        </w:rPr>
-        <w:t xml:space="preserve"> </w:t>
-      </w:r>
-      <w:proofErr w:type="spellStart"/>
-      <w:r>
-        <w:rPr>
-          <w:rFonts w:ascii="Times New Roman" w:eastAsia="Times New Roman" w:hAnsi="Times New Roman" w:cs="Times New Roman"/>
-          <w:sz w:val="28"/>
-          <w:szCs w:val="28"/>
-          <w:lang w:eastAsia="ru-RU"/>
-        </w:rPr>
-        <w:t>Branching</w:t>
-      </w:r>
-      <w:proofErr w:type="spellEnd"/>
-      <w:r>
-        <w:rPr>
-          <w:rFonts w:ascii="Times New Roman" w:eastAsia="Times New Roman" w:hAnsi="Times New Roman" w:cs="Times New Roman"/>
-          <w:sz w:val="28"/>
-          <w:szCs w:val="28"/>
-          <w:lang w:eastAsia="ru-RU"/>
-        </w:rPr>
-        <w:t>. В ходе выполнения лабораторной работы были успешно пройдены 4 базовых уровня в блоке «</w:t>
-      </w:r>
-      <w:r>
-        <w:rPr>
-          <w:rFonts w:ascii="Times New Roman" w:hAnsi="Times New Roman" w:cs="Times New Roman"/>
-          <w:i/>
-          <w:iCs/>
-          <w:sz w:val="28"/>
-          <w:szCs w:val="28"/>
-        </w:rPr>
-        <w:t xml:space="preserve">Знакомство с </w:t>
-      </w:r>
-      <w:proofErr w:type="spellStart"/>
-      <w:r>
-        <w:rPr>
-          <w:rFonts w:ascii="Times New Roman" w:hAnsi="Times New Roman" w:cs="Times New Roman"/>
-          <w:i/>
-          <w:iCs/>
-          <w:sz w:val="28"/>
-          <w:szCs w:val="28"/>
-        </w:rPr>
-        <w:t>Git</w:t>
-      </w:r>
-      <w:proofErr w:type="spellEnd"/>
-      <w:r>
-        <w:rPr>
-          <w:rFonts w:ascii="Times New Roman" w:hAnsi="Times New Roman" w:cs="Times New Roman"/>
-          <w:i/>
-          <w:iCs/>
-          <w:sz w:val="28"/>
-          <w:szCs w:val="28"/>
-        </w:rPr>
-        <w:t xml:space="preserve"> </w:t>
-      </w:r>
-      <w:proofErr w:type="spellStart"/>
-      <w:r>
-        <w:rPr>
-          <w:rFonts w:ascii="Times New Roman" w:hAnsi="Times New Roman" w:cs="Times New Roman"/>
-          <w:i/>
-          <w:iCs/>
-          <w:sz w:val="28"/>
-          <w:szCs w:val="28"/>
-        </w:rPr>
-        <w:t>Commit</w:t>
-      </w:r>
-      <w:proofErr w:type="spellEnd"/>
+        <w:t>Для закрепления теоретического материала и отработки навыков управления репозиторием со сложной структурой было выполнено практическое обучение в интерактивном симуляторе Learn Git Branching. В ходе выполнения лабораторной работы были успешно пройдены 4 базовых уровня в блоке «</w:t>
+      </w:r>
+      <w:r>
+        <w:rPr>
+          <w:rFonts w:ascii="Times New Roman" w:hAnsi="Times New Roman" w:cs="Times New Roman"/>
+          <w:i/>
+          <w:iCs/>
+          <w:sz w:val="28"/>
+          <w:szCs w:val="28"/>
+        </w:rPr>
+        <w:t>Знакомство с Git Commit</w:t>
+      </w:r>
       <w:r>
         <w:rPr>
           <w:rFonts w:ascii="Times New Roman" w:eastAsia="Times New Roman" w:hAnsi="Times New Roman" w:cs="Times New Roman"/>
@@ -1564,55 +1321,7 @@
           <w:szCs w:val="28"/>
           <w:lang w:eastAsia="ru-RU"/>
         </w:rPr>
-        <w:t xml:space="preserve">3.1. Уровень «Знакомство с </w:t>
-      </w:r>
-      <w:proofErr w:type="spellStart"/>
-      <w:r>
-        <w:rPr>
-          <w:rFonts w:ascii="Times New Roman" w:eastAsia="Times New Roman" w:hAnsi="Times New Roman" w:cs="Times New Roman"/>
-          <w:b/>
-          <w:bCs/>
-          <w:sz w:val="28"/>
-          <w:szCs w:val="28"/>
-          <w:lang w:eastAsia="ru-RU"/>
-        </w:rPr>
-        <w:t>Git</w:t>
-      </w:r>
-      <w:proofErr w:type="spellEnd"/>
-      <w:r>
-        <w:rPr>
-          <w:rFonts w:ascii="Times New Roman" w:eastAsia="Times New Roman" w:hAnsi="Times New Roman" w:cs="Times New Roman"/>
-          <w:b/>
-          <w:bCs/>
-          <w:sz w:val="28"/>
-          <w:szCs w:val="28"/>
-          <w:lang w:eastAsia="ru-RU"/>
-        </w:rPr>
-        <w:t xml:space="preserve"> </w:t>
-      </w:r>
-      <w:proofErr w:type="spellStart"/>
-      <w:r>
-        <w:rPr>
-          <w:rFonts w:ascii="Times New Roman" w:eastAsia="Times New Roman" w:hAnsi="Times New Roman" w:cs="Times New Roman"/>
-          <w:b/>
-          <w:bCs/>
-          <w:sz w:val="28"/>
-          <w:szCs w:val="28"/>
-          <w:lang w:eastAsia="ru-RU"/>
-        </w:rPr>
-        <w:t>Commit</w:t>
-      </w:r>
-      <w:proofErr w:type="spellEnd"/>
-      <w:r>
-        <w:rPr>
-          <w:rFonts w:ascii="Times New Roman" w:eastAsia="Times New Roman" w:hAnsi="Times New Roman" w:cs="Times New Roman"/>
-          <w:b/>
-          <w:bCs/>
-          <w:sz w:val="28"/>
-          <w:szCs w:val="28"/>
-          <w:lang w:eastAsia="ru-RU"/>
-        </w:rPr>
-        <w:t>»</w:t>
+        <w:t>3.1. Уровень «Знакомство с Git Commit»</w:t>
       </w:r>
     </w:p>
     <w:p>
@@ -1673,43 +1382,17 @@
           <w:szCs w:val="28"/>
         </w:rPr>
       </w:pPr>
-      <w:proofErr w:type="spellStart"/>
-      <w:r>
-        <w:rPr>
-          <w:rFonts w:ascii="Times New Roman" w:hAnsi="Times New Roman" w:cs="Times New Roman"/>
-          <w:i/>
-          <w:iCs/>
-          <w:color w:val="808080" w:themeColor="background1" w:themeShade="80"/>
-          <w:sz w:val="28"/>
-          <w:szCs w:val="28"/>
-        </w:rPr>
-        <w:t>git</w:t>
-      </w:r>
-      <w:proofErr w:type="spellEnd"/>
-      <w:r>
-        <w:rPr>
-          <w:rFonts w:ascii="Times New Roman" w:hAnsi="Times New Roman" w:cs="Times New Roman"/>
-          <w:i/>
-          <w:iCs/>
-          <w:color w:val="808080" w:themeColor="background1" w:themeShade="80"/>
-          <w:sz w:val="28"/>
-          <w:szCs w:val="28"/>
-        </w:rPr>
-        <w:t xml:space="preserve"> </w:t>
-      </w:r>
-      <w:proofErr w:type="spellStart"/>
-      <w:r>
-        <w:rPr>
-          <w:rFonts w:ascii="Times New Roman" w:hAnsi="Times New Roman" w:cs="Times New Roman"/>
-          <w:i/>
-          <w:iCs/>
-          <w:color w:val="808080" w:themeColor="background1" w:themeShade="80"/>
-          <w:sz w:val="28"/>
-          <w:szCs w:val="28"/>
-        </w:rPr>
-        <w:t>commit</w:t>
-      </w:r>
-      <w:proofErr w:type="spellEnd"/>
+      <w:r>
+        <w:rPr>
+          <w:rFonts w:ascii="Times New Roman" w:hAnsi="Times New Roman" w:cs="Times New Roman"/>
+          <w:i/>
+          <w:iCs/>
+          <w:color w:val="808080" w:themeColor="background1" w:themeShade="80"/>
+          <w:sz w:val="28"/>
+          <w:szCs w:val="28"/>
+        </w:rPr>
+        <w:t>git commit</w:t>
+      </w:r>
     </w:p>
     <w:p>
       <w:pPr>
@@ -1725,43 +1408,17 @@
           <w:szCs w:val="28"/>
         </w:rPr>
       </w:pPr>
-      <w:proofErr w:type="spellStart"/>
-      <w:r>
-        <w:rPr>
-          <w:rFonts w:ascii="Times New Roman" w:hAnsi="Times New Roman" w:cs="Times New Roman"/>
-          <w:i/>
-          <w:iCs/>
-          <w:color w:val="808080" w:themeColor="background1" w:themeShade="80"/>
-          <w:sz w:val="28"/>
-          <w:szCs w:val="28"/>
-        </w:rPr>
-        <w:t>git</w:t>
-      </w:r>
-      <w:proofErr w:type="spellEnd"/>
-      <w:r>
-        <w:rPr>
-          <w:rFonts w:ascii="Times New Roman" w:hAnsi="Times New Roman" w:cs="Times New Roman"/>
-          <w:i/>
-          <w:iCs/>
-          <w:color w:val="808080" w:themeColor="background1" w:themeShade="80"/>
-          <w:sz w:val="28"/>
-          <w:szCs w:val="28"/>
-        </w:rPr>
-        <w:t xml:space="preserve"> </w:t>
-      </w:r>
-      <w:proofErr w:type="spellStart"/>
-      <w:r>
-        <w:rPr>
-          <w:rFonts w:ascii="Times New Roman" w:hAnsi="Times New Roman" w:cs="Times New Roman"/>
-          <w:i/>
-          <w:iCs/>
-          <w:color w:val="808080" w:themeColor="background1" w:themeShade="80"/>
-          <w:sz w:val="28"/>
-          <w:szCs w:val="28"/>
-        </w:rPr>
-        <w:t>commit</w:t>
-      </w:r>
-      <w:proofErr w:type="spellEnd"/>
+      <w:r>
+        <w:rPr>
+          <w:rFonts w:ascii="Times New Roman" w:hAnsi="Times New Roman" w:cs="Times New Roman"/>
+          <w:i/>
+          <w:iCs/>
+          <w:color w:val="808080" w:themeColor="background1" w:themeShade="80"/>
+          <w:sz w:val="28"/>
+          <w:szCs w:val="28"/>
+        </w:rPr>
+        <w:t>git commit</w:t>
+      </w:r>
     </w:p>
     <w:p>
       <w:pPr>
@@ -1841,18 +1498,8 @@
           <w:i/>
           <w:iCs/>
         </w:rPr>
-        <w:t xml:space="preserve">Рисунок 1 — Успешное выполнение базовых коммитов в ветке </w:t>
-      </w:r>
-      <w:proofErr w:type="spellStart"/>
-      <w:r>
-        <w:rPr>
-          <w:rFonts w:ascii="Times New Roman" w:hAnsi="Times New Roman" w:cs="Times New Roman"/>
-          <w:i/>
-          <w:iCs/>
-        </w:rPr>
-        <w:t>main</w:t>
-      </w:r>
-      <w:proofErr w:type="spellEnd"/>
+        <w:t>Рисунок 1 — Успешное выполнение базовых коммитов в ветке main</w:t>
+      </w:r>
     </w:p>
     <w:p>
       <w:pPr>
@@ -1901,31 +1548,7 @@
           <w:lang w:eastAsia="ru-RU"/>
         </w:rPr>
         <w:lastRenderedPageBreak/>
-        <w:t xml:space="preserve">3.2. Уровень «Ветвление в </w:t>
-      </w:r>
-      <w:proofErr w:type="spellStart"/>
-      <w:r>
-        <w:rPr>
-          <w:rFonts w:ascii="Times New Roman" w:eastAsia="Times New Roman" w:hAnsi="Times New Roman" w:cs="Times New Roman"/>
-          <w:b/>
-          <w:bCs/>
-          <w:sz w:val="28"/>
-          <w:szCs w:val="28"/>
-          <w:lang w:eastAsia="ru-RU"/>
-        </w:rPr>
-        <w:t>Git</w:t>
-      </w:r>
-      <w:proofErr w:type="spellEnd"/>
-      <w:r>
-        <w:rPr>
-          <w:rFonts w:ascii="Times New Roman" w:eastAsia="Times New Roman" w:hAnsi="Times New Roman" w:cs="Times New Roman"/>
-          <w:b/>
-          <w:bCs/>
-          <w:sz w:val="28"/>
-          <w:szCs w:val="28"/>
-          <w:lang w:eastAsia="ru-RU"/>
-        </w:rPr>
-        <w:t>»</w:t>
+        <w:t>3.2. Уровень «Ветвление в Git»</w:t>
       </w:r>
     </w:p>
     <w:p>
@@ -1947,27 +1570,7 @@
           <w:szCs w:val="28"/>
           <w:lang w:eastAsia="ru-RU"/>
         </w:rPr>
-        <w:t xml:space="preserve">На данном этапе было изучено создание параллельных веток разработки для изоляции нового функционала. С помощью оптимизированной команды была создана новая изолированная ветка с именем </w:t>
-      </w:r>
-      <w:proofErr w:type="spellStart"/>
-      <w:r>
-        <w:rPr>
-          <w:rFonts w:ascii="Times New Roman" w:eastAsia="Times New Roman" w:hAnsi="Times New Roman" w:cs="Times New Roman"/>
-          <w:sz w:val="28"/>
-          <w:szCs w:val="28"/>
-          <w:lang w:eastAsia="ru-RU"/>
-        </w:rPr>
-        <w:t>bugFix</w:t>
-      </w:r>
-      <w:proofErr w:type="spellEnd"/>
-      <w:r>
-        <w:rPr>
-          <w:rFonts w:ascii="Times New Roman" w:eastAsia="Times New Roman" w:hAnsi="Times New Roman" w:cs="Times New Roman"/>
-          <w:sz w:val="28"/>
-          <w:szCs w:val="28"/>
-          <w:lang w:eastAsia="ru-RU"/>
-        </w:rPr>
-        <w:t xml:space="preserve"> с одновременным автоматическим переключением указателя текущей позиции (HEAD) на неё.</w:t>
+        <w:t>На данном этапе было изучено создание параллельных веток разработки для изоляции нового функционала. С помощью оптимизированной команды была создана новая изолированная ветка с именем bugFix с одновременным автоматическим переключением указателя текущей позиции (HEAD) на неё.</w:t>
       </w:r>
     </w:p>
     <w:p>
@@ -2006,67 +1609,17 @@
           <w:szCs w:val="28"/>
         </w:rPr>
       </w:pPr>
-      <w:proofErr w:type="spellStart"/>
-      <w:r>
-        <w:rPr>
-          <w:rFonts w:ascii="Times New Roman" w:hAnsi="Times New Roman" w:cs="Times New Roman"/>
-          <w:i/>
-          <w:iCs/>
-          <w:color w:val="808080" w:themeColor="background1" w:themeShade="80"/>
-          <w:sz w:val="28"/>
-          <w:szCs w:val="28"/>
-        </w:rPr>
-        <w:t>git</w:t>
-      </w:r>
-      <w:proofErr w:type="spellEnd"/>
-      <w:r>
-        <w:rPr>
-          <w:rFonts w:ascii="Times New Roman" w:hAnsi="Times New Roman" w:cs="Times New Roman"/>
-          <w:i/>
-          <w:iCs/>
-          <w:color w:val="808080" w:themeColor="background1" w:themeShade="80"/>
-          <w:sz w:val="28"/>
-          <w:szCs w:val="28"/>
-        </w:rPr>
-        <w:t xml:space="preserve"> </w:t>
-      </w:r>
-      <w:proofErr w:type="spellStart"/>
-      <w:r>
-        <w:rPr>
-          <w:rFonts w:ascii="Times New Roman" w:hAnsi="Times New Roman" w:cs="Times New Roman"/>
-          <w:i/>
-          <w:iCs/>
-          <w:color w:val="808080" w:themeColor="background1" w:themeShade="80"/>
-          <w:sz w:val="28"/>
-          <w:szCs w:val="28"/>
-        </w:rPr>
-        <w:t>checkout</w:t>
-      </w:r>
-      <w:proofErr w:type="spellEnd"/>
-      <w:r>
-        <w:rPr>
-          <w:rFonts w:ascii="Times New Roman" w:hAnsi="Times New Roman" w:cs="Times New Roman"/>
-          <w:i/>
-          <w:iCs/>
-          <w:color w:val="808080" w:themeColor="background1" w:themeShade="80"/>
-          <w:sz w:val="28"/>
-          <w:szCs w:val="28"/>
-        </w:rPr>
-        <w:t xml:space="preserve"> -b </w:t>
-      </w:r>
-      <w:proofErr w:type="spellStart"/>
-      <w:r>
-        <w:rPr>
-          <w:rFonts w:ascii="Times New Roman" w:hAnsi="Times New Roman" w:cs="Times New Roman"/>
-          <w:i/>
-          <w:iCs/>
-          <w:color w:val="808080" w:themeColor="background1" w:themeShade="80"/>
-          <w:sz w:val="28"/>
-          <w:szCs w:val="28"/>
-        </w:rPr>
-        <w:t>bugFix</w:t>
-      </w:r>
-      <w:proofErr w:type="spellEnd"/>
+      <w:r>
+        <w:rPr>
+          <w:rFonts w:ascii="Times New Roman" w:hAnsi="Times New Roman" w:cs="Times New Roman"/>
+          <w:i/>
+          <w:iCs/>
+          <w:color w:val="808080" w:themeColor="background1" w:themeShade="80"/>
+          <w:sz w:val="28"/>
+          <w:szCs w:val="28"/>
+        </w:rPr>
+        <w:t>git checkout -b bugFix</w:t>
+      </w:r>
     </w:p>
     <w:p>
       <w:pPr>
@@ -2149,27 +1702,7 @@
           <w:iCs/>
           <w:lang w:eastAsia="ru-RU"/>
         </w:rPr>
-        <w:t xml:space="preserve">Рисунок 2 — Создание новой изолированной ветки </w:t>
-      </w:r>
-      <w:proofErr w:type="spellStart"/>
-      <w:r>
-        <w:rPr>
-          <w:rFonts w:ascii="Times New Roman" w:eastAsia="Times New Roman" w:hAnsi="Times New Roman" w:cs="Times New Roman"/>
-          <w:i/>
-          <w:iCs/>
-          <w:lang w:eastAsia="ru-RU"/>
-        </w:rPr>
-        <w:t>bugFix</w:t>
-      </w:r>
-      <w:proofErr w:type="spellEnd"/>
-      <w:r>
-        <w:rPr>
-          <w:rFonts w:ascii="Times New Roman" w:eastAsia="Times New Roman" w:hAnsi="Times New Roman" w:cs="Times New Roman"/>
-          <w:i/>
-          <w:iCs/>
-          <w:lang w:eastAsia="ru-RU"/>
-        </w:rPr>
-        <w:t xml:space="preserve"> с переключением контекста</w:t>
+        <w:t>Рисунок 2 — Создание новой изолированной ветки bugFix с переключением контекста</w:t>
       </w:r>
     </w:p>
     <w:p>
@@ -2219,31 +1752,7 @@
           <w:lang w:eastAsia="ru-RU"/>
         </w:rPr>
         <w:lastRenderedPageBreak/>
-        <w:t xml:space="preserve">3.3. Уровень «Слияния веток в </w:t>
-      </w:r>
-      <w:proofErr w:type="spellStart"/>
-      <w:r>
-        <w:rPr>
-          <w:rFonts w:ascii="Times New Roman" w:eastAsia="Times New Roman" w:hAnsi="Times New Roman" w:cs="Times New Roman"/>
-          <w:b/>
-          <w:bCs/>
-          <w:sz w:val="28"/>
-          <w:szCs w:val="28"/>
-          <w:lang w:eastAsia="ru-RU"/>
-        </w:rPr>
-        <w:t>Git</w:t>
-      </w:r>
-      <w:proofErr w:type="spellEnd"/>
-      <w:r>
-        <w:rPr>
-          <w:rFonts w:ascii="Times New Roman" w:eastAsia="Times New Roman" w:hAnsi="Times New Roman" w:cs="Times New Roman"/>
-          <w:b/>
-          <w:bCs/>
-          <w:sz w:val="28"/>
-          <w:szCs w:val="28"/>
-          <w:lang w:eastAsia="ru-RU"/>
-        </w:rPr>
-        <w:t>»</w:t>
+        <w:t>3.3. Уровень «Слияния веток в Git»</w:t>
       </w:r>
     </w:p>
     <w:p>
@@ -2265,107 +1774,7 @@
           <w:szCs w:val="28"/>
           <w:lang w:eastAsia="ru-RU"/>
         </w:rPr>
-        <w:t>На данном этапе была отработана базовая стратегия интеграции кода с помощью операции слияния (</w:t>
-      </w:r>
-      <w:proofErr w:type="spellStart"/>
-      <w:r>
-        <w:rPr>
-          <w:rFonts w:ascii="Times New Roman" w:eastAsia="Times New Roman" w:hAnsi="Times New Roman" w:cs="Times New Roman"/>
-          <w:sz w:val="28"/>
-          <w:szCs w:val="28"/>
-          <w:lang w:eastAsia="ru-RU"/>
-        </w:rPr>
-        <w:t>merge</w:t>
-      </w:r>
-      <w:proofErr w:type="spellEnd"/>
-      <w:r>
-        <w:rPr>
-          <w:rFonts w:ascii="Times New Roman" w:eastAsia="Times New Roman" w:hAnsi="Times New Roman" w:cs="Times New Roman"/>
-          <w:sz w:val="28"/>
-          <w:szCs w:val="28"/>
-          <w:lang w:eastAsia="ru-RU"/>
-        </w:rPr>
-        <w:t xml:space="preserve">). Были зафиксированы параллельные изменения как в изолированной ветке </w:t>
-      </w:r>
-      <w:proofErr w:type="spellStart"/>
-      <w:r>
-        <w:rPr>
-          <w:rFonts w:ascii="Times New Roman" w:eastAsia="Times New Roman" w:hAnsi="Times New Roman" w:cs="Times New Roman"/>
-          <w:sz w:val="28"/>
-          <w:szCs w:val="28"/>
-          <w:lang w:eastAsia="ru-RU"/>
-        </w:rPr>
-        <w:t>bugFix</w:t>
-      </w:r>
-      <w:proofErr w:type="spellEnd"/>
-      <w:r>
-        <w:rPr>
-          <w:rFonts w:ascii="Times New Roman" w:eastAsia="Times New Roman" w:hAnsi="Times New Roman" w:cs="Times New Roman"/>
-          <w:sz w:val="28"/>
-          <w:szCs w:val="28"/>
-          <w:lang w:eastAsia="ru-RU"/>
-        </w:rPr>
-        <w:t xml:space="preserve">, так и в основной ветке </w:t>
-      </w:r>
-      <w:proofErr w:type="spellStart"/>
-      <w:r>
-        <w:rPr>
-          <w:rFonts w:ascii="Times New Roman" w:eastAsia="Times New Roman" w:hAnsi="Times New Roman" w:cs="Times New Roman"/>
-          <w:sz w:val="28"/>
-          <w:szCs w:val="28"/>
-          <w:lang w:eastAsia="ru-RU"/>
-        </w:rPr>
-        <w:t>main</w:t>
-      </w:r>
-      <w:proofErr w:type="spellEnd"/>
-      <w:r>
-        <w:rPr>
-          <w:rFonts w:ascii="Times New Roman" w:eastAsia="Times New Roman" w:hAnsi="Times New Roman" w:cs="Times New Roman"/>
-          <w:sz w:val="28"/>
-          <w:szCs w:val="28"/>
-          <w:lang w:eastAsia="ru-RU"/>
-        </w:rPr>
-        <w:t xml:space="preserve">, после чего ветка </w:t>
-      </w:r>
-      <w:proofErr w:type="spellStart"/>
-      <w:r>
-        <w:rPr>
-          <w:rFonts w:ascii="Times New Roman" w:eastAsia="Times New Roman" w:hAnsi="Times New Roman" w:cs="Times New Roman"/>
-          <w:sz w:val="28"/>
-          <w:szCs w:val="28"/>
-          <w:lang w:eastAsia="ru-RU"/>
-        </w:rPr>
-        <w:t>bugFix</w:t>
-      </w:r>
-      <w:proofErr w:type="spellEnd"/>
-      <w:r>
-        <w:rPr>
-          <w:rFonts w:ascii="Times New Roman" w:eastAsia="Times New Roman" w:hAnsi="Times New Roman" w:cs="Times New Roman"/>
-          <w:sz w:val="28"/>
-          <w:szCs w:val="28"/>
-          <w:lang w:eastAsia="ru-RU"/>
-        </w:rPr>
-        <w:t xml:space="preserve"> была успешно влита в основную линию разработки с формированием классического </w:t>
-      </w:r>
-      <w:proofErr w:type="spellStart"/>
-      <w:r>
-        <w:rPr>
-          <w:rFonts w:ascii="Times New Roman" w:eastAsia="Times New Roman" w:hAnsi="Times New Roman" w:cs="Times New Roman"/>
-          <w:sz w:val="28"/>
-          <w:szCs w:val="28"/>
-          <w:lang w:eastAsia="ru-RU"/>
-        </w:rPr>
-        <w:t>merge</w:t>
-      </w:r>
-      <w:proofErr w:type="spellEnd"/>
-      <w:r>
-        <w:rPr>
-          <w:rFonts w:ascii="Times New Roman" w:eastAsia="Times New Roman" w:hAnsi="Times New Roman" w:cs="Times New Roman"/>
-          <w:sz w:val="28"/>
-          <w:szCs w:val="28"/>
-          <w:lang w:eastAsia="ru-RU"/>
-        </w:rPr>
-        <w:t>-коммита.</w:t>
+        <w:t>На данном этапе была отработана базовая стратегия интеграции кода с помощью операции слияния (merge). Были зафиксированы параллельные изменения как в изолированной ветке bugFix, так и в основной ветке main, после чего ветка bugFix была успешно влита в основную линию разработки с формированием классического merge-коммита.</w:t>
       </w:r>
     </w:p>
     <w:p>
@@ -2402,22 +1811,77 @@
           <w:color w:val="808080" w:themeColor="background1" w:themeShade="80"/>
           <w:sz w:val="28"/>
           <w:szCs w:val="28"/>
-          <w:lang w:val="en-US"/>
-        </w:rPr>
-      </w:pPr>
-      <w:r>
-        <w:rPr>
-          <w:rFonts w:ascii="Times New Roman" w:hAnsi="Times New Roman" w:cs="Times New Roman"/>
-          <w:i/>
-          <w:iCs/>
-          <w:color w:val="808080" w:themeColor="background1" w:themeShade="80"/>
-          <w:sz w:val="28"/>
-          <w:szCs w:val="28"/>
-          <w:lang w:val="en-US"/>
-        </w:rPr>
-        <w:t xml:space="preserve">git checkout -b </w:t>
-      </w:r>
-      <w:proofErr w:type="spellStart"/>
+        </w:rPr>
+      </w:pPr>
+      <w:r>
+        <w:rPr>
+          <w:rFonts w:ascii="Times New Roman" w:hAnsi="Times New Roman" w:cs="Times New Roman"/>
+          <w:i/>
+          <w:iCs/>
+          <w:color w:val="808080" w:themeColor="background1" w:themeShade="80"/>
+          <w:sz w:val="28"/>
+          <w:szCs w:val="28"/>
+          <w:lang w:val="en-US"/>
+        </w:rPr>
+        <w:t>git</w:t>
+      </w:r>
+      <w:r>
+        <w:rPr>
+          <w:rFonts w:ascii="Times New Roman" w:hAnsi="Times New Roman" w:cs="Times New Roman"/>
+          <w:i/>
+          <w:iCs/>
+          <w:color w:val="808080" w:themeColor="background1" w:themeShade="80"/>
+          <w:sz w:val="28"/>
+          <w:szCs w:val="28"/>
+        </w:rPr>
+        <w:t xml:space="preserve"> </w:t>
+      </w:r>
+      <w:r>
+        <w:rPr>
+          <w:rFonts w:ascii="Times New Roman" w:hAnsi="Times New Roman" w:cs="Times New Roman"/>
+          <w:i/>
+          <w:iCs/>
+          <w:color w:val="808080" w:themeColor="background1" w:themeShade="80"/>
+          <w:sz w:val="28"/>
+          <w:szCs w:val="28"/>
+          <w:lang w:val="en-US"/>
+        </w:rPr>
+        <w:t>checkout</w:t>
+      </w:r>
+      <w:r>
+        <w:rPr>
+          <w:rFonts w:ascii="Times New Roman" w:hAnsi="Times New Roman" w:cs="Times New Roman"/>
+          <w:i/>
+          <w:iCs/>
+          <w:color w:val="808080" w:themeColor="background1" w:themeShade="80"/>
+          <w:sz w:val="28"/>
+          <w:szCs w:val="28"/>
+        </w:rPr>
+        <w:t xml:space="preserve"> -</w:t>
+      </w:r>
+      <w:r>
+        <w:rPr>
+          <w:rFonts w:ascii="Times New Roman" w:hAnsi="Times New Roman" w:cs="Times New Roman"/>
+          <w:i/>
+          <w:iCs/>
+          <w:color w:val="808080" w:themeColor="background1" w:themeShade="80"/>
+          <w:sz w:val="28"/>
+          <w:szCs w:val="28"/>
+          <w:lang w:val="en-US"/>
+        </w:rPr>
+        <w:t>b</w:t>
+      </w:r>
+      <w:r>
+        <w:rPr>
+          <w:rFonts w:ascii="Times New Roman" w:hAnsi="Times New Roman" w:cs="Times New Roman"/>
+          <w:i/>
+          <w:iCs/>
+          <w:color w:val="808080" w:themeColor="background1" w:themeShade="80"/>
+          <w:sz w:val="28"/>
+          <w:szCs w:val="28"/>
+        </w:rPr>
+        <w:t xml:space="preserve"> </w:t>
+      </w:r>
       <w:r>
         <w:rPr>
           <w:rFonts w:ascii="Times New Roman" w:hAnsi="Times New Roman" w:cs="Times New Roman"/>
@@ -2430,7 +1894,6 @@
         </w:rPr>
         <w:t>bugFix</w:t>
       </w:r>
-      <w:proofErr w:type="spellEnd"/>
     </w:p>
     <w:p>
       <w:pPr>
@@ -2457,22 +1920,8 @@
           <w:szCs w:val="28"/>
           <w:lang w:val="en-US"/>
         </w:rPr>
-        <w:t xml:space="preserve">git </w:t>
-      </w:r>
-      <w:proofErr w:type="gramStart"/>
-      <w:r>
-        <w:rPr>
-          <w:rFonts w:ascii="Times New Roman" w:hAnsi="Times New Roman" w:cs="Times New Roman"/>
-          <w:i/>
-          <w:iCs/>
-          <w:color w:val="808080" w:themeColor="background1" w:themeShade="80"/>
-          <w:sz w:val="28"/>
-          <w:szCs w:val="28"/>
-          <w:lang w:val="en-US"/>
-        </w:rPr>
-        <w:t>commit</w:t>
-      </w:r>
-      <w:proofErr w:type="gramEnd"/>
+        <w:t>git commit</w:t>
+      </w:r>
     </w:p>
     <w:p>
       <w:pPr>
@@ -2527,22 +1976,8 @@
           <w:szCs w:val="28"/>
           <w:lang w:val="en-US"/>
         </w:rPr>
-        <w:t xml:space="preserve">git </w:t>
-      </w:r>
-      <w:proofErr w:type="gramStart"/>
-      <w:r>
-        <w:rPr>
-          <w:rFonts w:ascii="Times New Roman" w:hAnsi="Times New Roman" w:cs="Times New Roman"/>
-          <w:i/>
-          <w:iCs/>
-          <w:color w:val="808080" w:themeColor="background1" w:themeShade="80"/>
-          <w:sz w:val="28"/>
-          <w:szCs w:val="28"/>
-          <w:lang w:val="en-US"/>
-        </w:rPr>
-        <w:t>commit</w:t>
-      </w:r>
-      <w:proofErr w:type="gramEnd"/>
+        <w:t>git commit</w:t>
+      </w:r>
     </w:p>
     <w:p>
       <w:pPr>
@@ -2569,22 +2004,8 @@
           <w:szCs w:val="28"/>
           <w:lang w:val="en-US"/>
         </w:rPr>
-        <w:t xml:space="preserve">git merge </w:t>
-      </w:r>
-      <w:proofErr w:type="spellStart"/>
-      <w:r>
-        <w:rPr>
-          <w:rFonts w:ascii="Times New Roman" w:hAnsi="Times New Roman" w:cs="Times New Roman"/>
-          <w:i/>
-          <w:iCs/>
-          <w:color w:val="808080" w:themeColor="background1" w:themeShade="80"/>
-          <w:sz w:val="28"/>
-          <w:szCs w:val="28"/>
-          <w:lang w:val="en-US"/>
-        </w:rPr>
-        <w:t>bugFix</w:t>
-      </w:r>
-      <w:proofErr w:type="spellEnd"/>
+        <w:t>git merge bugFix</w:t>
+      </w:r>
     </w:p>
     <w:p>
       <w:pPr>
@@ -2728,31 +2149,7 @@
           <w:lang w:eastAsia="ru-RU"/>
         </w:rPr>
         <w:lastRenderedPageBreak/>
-        <w:t xml:space="preserve">3.4. Уровень «Введение в </w:t>
-      </w:r>
-      <w:proofErr w:type="spellStart"/>
-      <w:r>
-        <w:rPr>
-          <w:rFonts w:ascii="Times New Roman" w:eastAsia="Times New Roman" w:hAnsi="Times New Roman" w:cs="Times New Roman"/>
-          <w:b/>
-          <w:bCs/>
-          <w:sz w:val="28"/>
-          <w:szCs w:val="28"/>
-          <w:lang w:eastAsia="ru-RU"/>
-        </w:rPr>
-        <w:t>rebase</w:t>
-      </w:r>
-      <w:proofErr w:type="spellEnd"/>
-      <w:r>
-        <w:rPr>
-          <w:rFonts w:ascii="Times New Roman" w:eastAsia="Times New Roman" w:hAnsi="Times New Roman" w:cs="Times New Roman"/>
-          <w:b/>
-          <w:bCs/>
-          <w:sz w:val="28"/>
-          <w:szCs w:val="28"/>
-          <w:lang w:eastAsia="ru-RU"/>
-        </w:rPr>
-        <w:t>»</w:t>
+        <w:t>3.4. Уровень «Введение в rebase»</w:t>
       </w:r>
     </w:p>
     <w:p>
@@ -2774,107 +2171,7 @@
           <w:szCs w:val="28"/>
           <w:lang w:eastAsia="ru-RU"/>
         </w:rPr>
-        <w:t>На финальном этапе интерактивного обучения был освоен альтернативный, более гибкий метод интеграции кода — перебазирование (</w:t>
-      </w:r>
-      <w:proofErr w:type="spellStart"/>
-      <w:r>
-        <w:rPr>
-          <w:rFonts w:ascii="Times New Roman" w:eastAsia="Times New Roman" w:hAnsi="Times New Roman" w:cs="Times New Roman"/>
-          <w:sz w:val="28"/>
-          <w:szCs w:val="28"/>
-          <w:lang w:eastAsia="ru-RU"/>
-        </w:rPr>
-        <w:t>rebase</w:t>
-      </w:r>
-      <w:proofErr w:type="spellEnd"/>
-      <w:r>
-        <w:rPr>
-          <w:rFonts w:ascii="Times New Roman" w:eastAsia="Times New Roman" w:hAnsi="Times New Roman" w:cs="Times New Roman"/>
-          <w:sz w:val="28"/>
-          <w:szCs w:val="28"/>
-          <w:lang w:eastAsia="ru-RU"/>
-        </w:rPr>
-        <w:t xml:space="preserve">). В процессе выполнения была зафиксирована ошибка обращения к несуществующей ветке, после чего была корректно создана ветка </w:t>
-      </w:r>
-      <w:proofErr w:type="spellStart"/>
-      <w:r>
-        <w:rPr>
-          <w:rFonts w:ascii="Times New Roman" w:eastAsia="Times New Roman" w:hAnsi="Times New Roman" w:cs="Times New Roman"/>
-          <w:sz w:val="28"/>
-          <w:szCs w:val="28"/>
-          <w:lang w:eastAsia="ru-RU"/>
-        </w:rPr>
-        <w:t>bugFix</w:t>
-      </w:r>
-      <w:proofErr w:type="spellEnd"/>
-      <w:r>
-        <w:rPr>
-          <w:rFonts w:ascii="Times New Roman" w:eastAsia="Times New Roman" w:hAnsi="Times New Roman" w:cs="Times New Roman"/>
-          <w:sz w:val="28"/>
-          <w:szCs w:val="28"/>
-          <w:lang w:eastAsia="ru-RU"/>
-        </w:rPr>
-        <w:t xml:space="preserve">, произведена параллельная фиксация коммитов, а затем история изменений ветки </w:t>
-      </w:r>
-      <w:proofErr w:type="spellStart"/>
-      <w:r>
-        <w:rPr>
-          <w:rFonts w:ascii="Times New Roman" w:eastAsia="Times New Roman" w:hAnsi="Times New Roman" w:cs="Times New Roman"/>
-          <w:sz w:val="28"/>
-          <w:szCs w:val="28"/>
-          <w:lang w:eastAsia="ru-RU"/>
-        </w:rPr>
-        <w:t>bugFix</w:t>
-      </w:r>
-      <w:proofErr w:type="spellEnd"/>
-      <w:r>
-        <w:rPr>
-          <w:rFonts w:ascii="Times New Roman" w:eastAsia="Times New Roman" w:hAnsi="Times New Roman" w:cs="Times New Roman"/>
-          <w:sz w:val="28"/>
-          <w:szCs w:val="28"/>
-          <w:lang w:eastAsia="ru-RU"/>
-        </w:rPr>
-        <w:t xml:space="preserve"> была успешно перенесена и выстроена линейно поверх актуальной вершины ветки </w:t>
-      </w:r>
-      <w:proofErr w:type="spellStart"/>
-      <w:r>
-        <w:rPr>
-          <w:rFonts w:ascii="Times New Roman" w:eastAsia="Times New Roman" w:hAnsi="Times New Roman" w:cs="Times New Roman"/>
-          <w:sz w:val="28"/>
-          <w:szCs w:val="28"/>
-          <w:lang w:eastAsia="ru-RU"/>
-        </w:rPr>
-        <w:t>main</w:t>
-      </w:r>
-      <w:proofErr w:type="spellEnd"/>
-      <w:r>
-        <w:rPr>
-          <w:rFonts w:ascii="Times New Roman" w:eastAsia="Times New Roman" w:hAnsi="Times New Roman" w:cs="Times New Roman"/>
-          <w:sz w:val="28"/>
-          <w:szCs w:val="28"/>
-          <w:lang w:eastAsia="ru-RU"/>
-        </w:rPr>
-        <w:t xml:space="preserve">. Это позволило получить чистую историю репозитория без создания избыточных </w:t>
-      </w:r>
-      <w:proofErr w:type="spellStart"/>
-      <w:r>
-        <w:rPr>
-          <w:rFonts w:ascii="Times New Roman" w:eastAsia="Times New Roman" w:hAnsi="Times New Roman" w:cs="Times New Roman"/>
-          <w:sz w:val="28"/>
-          <w:szCs w:val="28"/>
-          <w:lang w:eastAsia="ru-RU"/>
-        </w:rPr>
-        <w:t>merge</w:t>
-      </w:r>
-      <w:proofErr w:type="spellEnd"/>
-      <w:r>
-        <w:rPr>
-          <w:rFonts w:ascii="Times New Roman" w:eastAsia="Times New Roman" w:hAnsi="Times New Roman" w:cs="Times New Roman"/>
-          <w:sz w:val="28"/>
-          <w:szCs w:val="28"/>
-          <w:lang w:eastAsia="ru-RU"/>
-        </w:rPr>
-        <w:t>-узлов.</w:t>
+        <w:t>На финальном этапе интерактивного обучения был освоен альтернативный, более гибкий метод интеграции кода — перебазирование (rebase). В процессе выполнения была зафиксирована ошибка обращения к несуществующей ветке, после чего была корректно создана ветка bugFix, произведена параллельная фиксация коммитов, а затем история изменений ветки bugFix была успешно перенесена и выстроена линейно поверх актуальной вершины ветки main. Это позволило получить чистую историю репозитория без создания избыточных merge-узлов.</w:t>
       </w:r>
     </w:p>
     <w:p>
@@ -2911,22 +2208,77 @@
           <w:color w:val="808080" w:themeColor="background1" w:themeShade="80"/>
           <w:sz w:val="28"/>
           <w:szCs w:val="28"/>
-          <w:lang w:val="en-US"/>
-        </w:rPr>
-      </w:pPr>
-      <w:r>
-        <w:rPr>
-          <w:rFonts w:ascii="Times New Roman" w:hAnsi="Times New Roman" w:cs="Times New Roman"/>
-          <w:i/>
-          <w:iCs/>
-          <w:color w:val="808080" w:themeColor="background1" w:themeShade="80"/>
-          <w:sz w:val="28"/>
-          <w:szCs w:val="28"/>
-          <w:lang w:val="en-US"/>
-        </w:rPr>
-        <w:t xml:space="preserve">git checkout -b </w:t>
-      </w:r>
-      <w:proofErr w:type="spellStart"/>
+        </w:rPr>
+      </w:pPr>
+      <w:r>
+        <w:rPr>
+          <w:rFonts w:ascii="Times New Roman" w:hAnsi="Times New Roman" w:cs="Times New Roman"/>
+          <w:i/>
+          <w:iCs/>
+          <w:color w:val="808080" w:themeColor="background1" w:themeShade="80"/>
+          <w:sz w:val="28"/>
+          <w:szCs w:val="28"/>
+          <w:lang w:val="en-US"/>
+        </w:rPr>
+        <w:t>git</w:t>
+      </w:r>
+      <w:r>
+        <w:rPr>
+          <w:rFonts w:ascii="Times New Roman" w:hAnsi="Times New Roman" w:cs="Times New Roman"/>
+          <w:i/>
+          <w:iCs/>
+          <w:color w:val="808080" w:themeColor="background1" w:themeShade="80"/>
+          <w:sz w:val="28"/>
+          <w:szCs w:val="28"/>
+        </w:rPr>
+        <w:t xml:space="preserve"> </w:t>
+      </w:r>
+      <w:r>
+        <w:rPr>
+          <w:rFonts w:ascii="Times New Roman" w:hAnsi="Times New Roman" w:cs="Times New Roman"/>
+          <w:i/>
+          <w:iCs/>
+          <w:color w:val="808080" w:themeColor="background1" w:themeShade="80"/>
+          <w:sz w:val="28"/>
+          <w:szCs w:val="28"/>
+          <w:lang w:val="en-US"/>
+        </w:rPr>
+        <w:t>checkout</w:t>
+      </w:r>
+      <w:r>
+        <w:rPr>
+          <w:rFonts w:ascii="Times New Roman" w:hAnsi="Times New Roman" w:cs="Times New Roman"/>
+          <w:i/>
+          <w:iCs/>
+          <w:color w:val="808080" w:themeColor="background1" w:themeShade="80"/>
+          <w:sz w:val="28"/>
+          <w:szCs w:val="28"/>
+        </w:rPr>
+        <w:t xml:space="preserve"> -</w:t>
+      </w:r>
+      <w:r>
+        <w:rPr>
+          <w:rFonts w:ascii="Times New Roman" w:hAnsi="Times New Roman" w:cs="Times New Roman"/>
+          <w:i/>
+          <w:iCs/>
+          <w:color w:val="808080" w:themeColor="background1" w:themeShade="80"/>
+          <w:sz w:val="28"/>
+          <w:szCs w:val="28"/>
+          <w:lang w:val="en-US"/>
+        </w:rPr>
+        <w:t>b</w:t>
+      </w:r>
+      <w:r>
+        <w:rPr>
+          <w:rFonts w:ascii="Times New Roman" w:hAnsi="Times New Roman" w:cs="Times New Roman"/>
+          <w:i/>
+          <w:iCs/>
+          <w:color w:val="808080" w:themeColor="background1" w:themeShade="80"/>
+          <w:sz w:val="28"/>
+          <w:szCs w:val="28"/>
+        </w:rPr>
+        <w:t xml:space="preserve"> </w:t>
+      </w:r>
       <w:r>
         <w:rPr>
           <w:rFonts w:ascii="Times New Roman" w:hAnsi="Times New Roman" w:cs="Times New Roman"/>
@@ -2939,7 +2291,6 @@
         </w:rPr>
         <w:t>bugFix</w:t>
       </w:r>
-      <w:proofErr w:type="spellEnd"/>
     </w:p>
     <w:p>
       <w:pPr>
@@ -2966,22 +2317,8 @@
           <w:szCs w:val="28"/>
           <w:lang w:val="en-US"/>
         </w:rPr>
-        <w:t xml:space="preserve">git </w:t>
-      </w:r>
-      <w:proofErr w:type="gramStart"/>
-      <w:r>
-        <w:rPr>
-          <w:rFonts w:ascii="Times New Roman" w:hAnsi="Times New Roman" w:cs="Times New Roman"/>
-          <w:i/>
-          <w:iCs/>
-          <w:color w:val="808080" w:themeColor="background1" w:themeShade="80"/>
-          <w:sz w:val="28"/>
-          <w:szCs w:val="28"/>
-          <w:lang w:val="en-US"/>
-        </w:rPr>
-        <w:t>commit</w:t>
-      </w:r>
-      <w:proofErr w:type="gramEnd"/>
+        <w:t>git commit</w:t>
+      </w:r>
     </w:p>
     <w:p>
       <w:pPr>
@@ -3036,22 +2373,8 @@
           <w:szCs w:val="28"/>
           <w:lang w:val="en-US"/>
         </w:rPr>
-        <w:t xml:space="preserve">git </w:t>
-      </w:r>
-      <w:proofErr w:type="gramStart"/>
-      <w:r>
-        <w:rPr>
-          <w:rFonts w:ascii="Times New Roman" w:hAnsi="Times New Roman" w:cs="Times New Roman"/>
-          <w:i/>
-          <w:iCs/>
-          <w:color w:val="808080" w:themeColor="background1" w:themeShade="80"/>
-          <w:sz w:val="28"/>
-          <w:szCs w:val="28"/>
-          <w:lang w:val="en-US"/>
-        </w:rPr>
-        <w:t>commit</w:t>
-      </w:r>
-      <w:proofErr w:type="gramEnd"/>
+        <w:t>git commit</w:t>
+      </w:r>
     </w:p>
     <w:p>
       <w:pPr>
@@ -3078,22 +2401,8 @@
           <w:szCs w:val="28"/>
           <w:lang w:val="en-US"/>
         </w:rPr>
-        <w:t xml:space="preserve">git checkout </w:t>
-      </w:r>
-      <w:proofErr w:type="spellStart"/>
-      <w:r>
-        <w:rPr>
-          <w:rFonts w:ascii="Times New Roman" w:hAnsi="Times New Roman" w:cs="Times New Roman"/>
-          <w:i/>
-          <w:iCs/>
-          <w:color w:val="808080" w:themeColor="background1" w:themeShade="80"/>
-          <w:sz w:val="28"/>
-          <w:szCs w:val="28"/>
-          <w:lang w:val="en-US"/>
-        </w:rPr>
-        <w:t>bugFix</w:t>
-      </w:r>
-      <w:proofErr w:type="spellEnd"/>
+        <w:t>git checkout bugFix</w:t>
+      </w:r>
     </w:p>
     <w:p>
       <w:pPr>
@@ -3107,22 +2416,31 @@
           <w:color w:val="808080" w:themeColor="background1" w:themeShade="80"/>
           <w:sz w:val="28"/>
           <w:szCs w:val="28"/>
-          <w:lang w:val="en-US"/>
-        </w:rPr>
-      </w:pPr>
-      <w:r>
-        <w:rPr>
-          <w:rFonts w:ascii="Times New Roman" w:hAnsi="Times New Roman" w:cs="Times New Roman"/>
-          <w:i/>
-          <w:iCs/>
-          <w:color w:val="808080" w:themeColor="background1" w:themeShade="80"/>
-          <w:sz w:val="28"/>
-          <w:szCs w:val="28"/>
-          <w:lang w:val="en-US"/>
-        </w:rPr>
-        <w:t xml:space="preserve">git </w:t>
-      </w:r>
-      <w:proofErr w:type="gramStart"/>
+        </w:rPr>
+      </w:pPr>
+      <w:r>
+        <w:rPr>
+          <w:rFonts w:ascii="Times New Roman" w:hAnsi="Times New Roman" w:cs="Times New Roman"/>
+          <w:i/>
+          <w:iCs/>
+          <w:color w:val="808080" w:themeColor="background1" w:themeShade="80"/>
+          <w:sz w:val="28"/>
+          <w:szCs w:val="28"/>
+          <w:lang w:val="en-US"/>
+        </w:rPr>
+        <w:t>git</w:t>
+      </w:r>
+      <w:r>
+        <w:rPr>
+          <w:rFonts w:ascii="Times New Roman" w:hAnsi="Times New Roman" w:cs="Times New Roman"/>
+          <w:i/>
+          <w:iCs/>
+          <w:color w:val="808080" w:themeColor="background1" w:themeShade="80"/>
+          <w:sz w:val="28"/>
+          <w:szCs w:val="28"/>
+        </w:rPr>
+        <w:t xml:space="preserve"> </w:t>
+      </w:r>
       <w:r>
         <w:rPr>
           <w:rFonts w:ascii="Times New Roman" w:hAnsi="Times New Roman" w:cs="Times New Roman"/>
@@ -3135,18 +2453,28 @@
         </w:rPr>
         <w:t>rebase</w:t>
       </w:r>
-      <w:proofErr w:type="gramEnd"/>
-      <w:r>
-        <w:rPr>
-          <w:rFonts w:ascii="Times New Roman" w:hAnsi="Times New Roman" w:cs="Times New Roman"/>
-          <w:i/>
-          <w:iCs/>
-          <w:color w:val="808080" w:themeColor="background1" w:themeShade="80"/>
-          <w:sz w:val="28"/>
-          <w:szCs w:val="28"/>
-          <w:lang w:val="en-US"/>
-        </w:rPr>
-        <w:t xml:space="preserve"> main</w:t>
+      <w:r>
+        <w:rPr>
+          <w:rFonts w:ascii="Times New Roman" w:hAnsi="Times New Roman" w:cs="Times New Roman"/>
+          <w:i/>
+          <w:iCs/>
+          <w:color w:val="808080" w:themeColor="background1" w:themeShade="80"/>
+          <w:sz w:val="28"/>
+          <w:szCs w:val="28"/>
+        </w:rPr>
+        <w:t xml:space="preserve"> </w:t>
+      </w:r>
+      <w:r>
+        <w:rPr>
+          <w:rFonts w:ascii="Times New Roman" w:hAnsi="Times New Roman" w:cs="Times New Roman"/>
+          <w:i/>
+          <w:iCs/>
+          <w:color w:val="808080" w:themeColor="background1" w:themeShade="80"/>
+          <w:sz w:val="28"/>
+          <w:szCs w:val="28"/>
+          <w:lang w:val="en-US"/>
+        </w:rPr>
+        <w:t>main</w:t>
       </w:r>
     </w:p>
     <w:p>
@@ -3227,36 +2555,8 @@
           <w:i/>
           <w:iCs/>
         </w:rPr>
-        <w:t xml:space="preserve">Рисунок 4 — Линейная структура репозитория после применения операции </w:t>
-      </w:r>
-      <w:proofErr w:type="spellStart"/>
-      <w:r>
-        <w:rPr>
-          <w:rFonts w:ascii="Times New Roman" w:hAnsi="Times New Roman" w:cs="Times New Roman"/>
-          <w:i/>
-          <w:iCs/>
-        </w:rPr>
-        <w:t>git</w:t>
-      </w:r>
-      <w:proofErr w:type="spellEnd"/>
-      <w:r>
-        <w:rPr>
-          <w:rFonts w:ascii="Times New Roman" w:hAnsi="Times New Roman" w:cs="Times New Roman"/>
-          <w:i/>
-          <w:iCs/>
-        </w:rPr>
-        <w:t xml:space="preserve"> </w:t>
-      </w:r>
-      <w:proofErr w:type="spellStart"/>
-      <w:r>
-        <w:rPr>
-          <w:rFonts w:ascii="Times New Roman" w:hAnsi="Times New Roman" w:cs="Times New Roman"/>
-          <w:i/>
-          <w:iCs/>
-        </w:rPr>
-        <w:t>rebase</w:t>
-      </w:r>
-      <w:proofErr w:type="spellEnd"/>
+        <w:t>Рисунок 4 — Линейная структура репозитория после применения операции git rebase</w:t>
+      </w:r>
     </w:p>
     <w:p>
       <w:pPr>
@@ -3318,45 +2618,8 @@
           <w:sz w:val="28"/>
           <w:szCs w:val="28"/>
         </w:rPr>
-        <w:t xml:space="preserve">В ходе этой работы я на практике разобрался, как устроен </w:t>
-      </w:r>
-      <w:proofErr w:type="spellStart"/>
-      <w:r>
-        <w:rPr>
-          <w:rFonts w:ascii="Times New Roman" w:hAnsi="Times New Roman" w:cs="Times New Roman"/>
-          <w:sz w:val="28"/>
-          <w:szCs w:val="28"/>
-        </w:rPr>
-        <w:t>Git</w:t>
-      </w:r>
-      <w:proofErr w:type="spellEnd"/>
-      <w:r>
-        <w:rPr>
-          <w:rFonts w:ascii="Times New Roman" w:hAnsi="Times New Roman" w:cs="Times New Roman"/>
-          <w:sz w:val="28"/>
-          <w:szCs w:val="28"/>
-        </w:rPr>
-        <w:t xml:space="preserve"> и зачем он нужен на реальных проектах. Я научился правильно сохранять файлы через коммиты, решать проблемы с загрузкой кода на </w:t>
-      </w:r>
-      <w:proofErr w:type="spellStart"/>
-      <w:r>
-        <w:rPr>
-          <w:rFonts w:ascii="Times New Roman" w:hAnsi="Times New Roman" w:cs="Times New Roman"/>
-          <w:sz w:val="28"/>
-          <w:szCs w:val="28"/>
-        </w:rPr>
-        <w:t>GitHub</w:t>
-      </w:r>
-      <w:proofErr w:type="spellEnd"/>
-      <w:r>
-        <w:rPr>
-          <w:rFonts w:ascii="Times New Roman" w:hAnsi="Times New Roman" w:cs="Times New Roman"/>
-          <w:sz w:val="28"/>
-          <w:szCs w:val="28"/>
-        </w:rPr>
-        <w:t xml:space="preserve">, а также потренировался работать с ветками и объединять код с помощью команд </w:t>
-      </w:r>
-      <w:proofErr w:type="spellStart"/>
+        <w:t xml:space="preserve">В ходе этой работы я на практике разобрался, как устроен Git и зачем он нужен на реальных проектах. Я научился правильно сохранять файлы через коммиты, решать проблемы с загрузкой кода на GitHub, а также потренировался работать с ветками и объединять код с помощью команд </w:t>
+      </w:r>
       <w:r>
         <w:rPr>
           <w:rStyle w:val="HTML"/>
@@ -3366,7 +2629,6 @@
         </w:rPr>
         <w:t>merge</w:t>
       </w:r>
-      <w:proofErr w:type="spellEnd"/>
       <w:r>
         <w:rPr>
           <w:rFonts w:ascii="Times New Roman" w:hAnsi="Times New Roman" w:cs="Times New Roman"/>
@@ -3375,7 +2637,6 @@
         </w:rPr>
         <w:t xml:space="preserve"> и </w:t>
       </w:r>
-      <w:proofErr w:type="spellStart"/>
       <w:r>
         <w:rPr>
           <w:rStyle w:val="HTML"/>
@@ -3385,7 +2646,6 @@
         </w:rPr>
         <w:t>rebase</w:t>
       </w:r>
-      <w:proofErr w:type="spellEnd"/>
       <w:r>
         <w:rPr>
           <w:rFonts w:ascii="Times New Roman" w:hAnsi="Times New Roman" w:cs="Times New Roman"/>
@@ -4798,6 +4058,18 @@
     <w:uiPriority w:val="99"/>
     <w:rsid w:val="00E833F5"/>
   </w:style>
+  <w:style w:type="character" w:styleId="aa">
+    <w:name w:val="Hyperlink"/>
+    <w:basedOn w:val="a0"/>
+    <w:uiPriority w:val="99"/>
+    <w:semiHidden/>
+    <w:unhideWhenUsed/>
+    <w:rsid w:val="000576F8"/>
+    <w:rPr>
+      <w:color w:val="0000FF"/>
+      <w:u w:val="single"/>
+    </w:rPr>
+  </w:style>
 </w:styles>
 </file>
 

</xml_diff>